<commit_message>
Focus the downloadable resume on recent work and public links.
Co-authored-by: Benjamin Roedell <benrobot@users.noreply.github.com>
</commit_message>
<xml_diff>
--- a/benjamin-roedell-resume.docx
+++ b/benjamin-roedell-resume.docx
@@ -27,7 +27,7 @@
           <w:color w:val="1C1F24"/>
           <w:sz w:val="24"/>
         </w:rPr>
-        <w:t>Solution Architect</w:t>
+        <w:t>Software Architect and Engineer</w:t>
       </w:r>
     </w:p>
     <w:p>
@@ -57,7 +57,7 @@
             <w:color w:val="1F4B6E"/>
             <w:u w:val="single"/>
           </w:rPr>
-          <w:t xml:space="preserve">LinkedIn</w:t>
+          <w:t xml:space="preserve">benrobot.github.io</w:t>
         </w:r>
       </w:hyperlink>
       <w:r>
@@ -78,7 +78,7 @@
             <w:color w:val="1F4B6E"/>
             <w:u w:val="single"/>
           </w:rPr>
-          <w:t xml:space="preserve">GitHub</w:t>
+          <w:t xml:space="preserve">linkedin.com/in/benjaminroedell</w:t>
         </w:r>
       </w:hyperlink>
       <w:r>
@@ -99,7 +99,7 @@
             <w:color w:val="1F4B6E"/>
             <w:u w:val="single"/>
           </w:rPr>
-          <w:t xml:space="preserve">GitHub summary</w:t>
+          <w:t xml:space="preserve">github.com/benrobot</w:t>
         </w:r>
       </w:hyperlink>
       <w:r>
@@ -120,34 +120,13 @@
             <w:color w:val="1F4B6E"/>
             <w:u w:val="single"/>
           </w:rPr>
-          <w:t xml:space="preserve">StackOverflow</w:t>
-        </w:r>
-      </w:hyperlink>
-      <w:r>
-        <w:rPr>
-          <w:rFonts w:ascii="Calibri" w:hAnsi="Calibri" w:cs="Calibri"/>
-          <w:b w:val="0"/>
-          <w:color w:val="1C1F24"/>
-          <w:sz w:val="20"/>
-        </w:rPr>
-        <w:t xml:space="preserve">   </w:t>
-      </w:r>
-      <w:hyperlink r:id="rId13">
-        <w:r>
-          <w:rPr>
-            <w:rFonts w:ascii="Calibri" w:hAnsi="Calibri" w:cs="Calibri"/>
-            <w:sz w:val="20"/>
-            <w:szCs w:val="20"/>
-            <w:color w:val="1F4B6E"/>
-            <w:u w:val="single"/>
-          </w:rPr>
-          <w:t xml:space="preserve">@BenjaminRoedell</w:t>
+          <w:t xml:space="preserve">stackoverflow.com/users/3166133</w:t>
         </w:r>
       </w:hyperlink>
     </w:p>
     <w:p>
       <w:pPr>
-        <w:spacing w:before="240" w:after="40" w:line="240" w:lineRule="auto"/>
+        <w:spacing w:before="160" w:after="20" w:line="240" w:lineRule="auto"/>
         <w:pBdr>
           <w:bottom w:val="single" w:sz="8" w:space="1" w:color="1C1F24"/>
         </w:pBdr>
@@ -192,7 +171,118 @@
     </w:p>
     <w:p>
       <w:pPr>
-        <w:spacing w:before="240" w:after="40" w:line="240" w:lineRule="auto"/>
+        <w:spacing w:before="0" w:after="40" w:line="240" w:lineRule="auto"/>
+      </w:pPr>
+      <w:r>
+        <w:rPr>
+          <w:rFonts w:ascii="Calibri" w:hAnsi="Calibri" w:cs="Calibri"/>
+          <w:b w:val="0"/>
+          <w:color w:val="1C1F24"/>
+          <w:sz w:val="22"/>
+        </w:rPr>
+        <w:t>Native English and Spanish speaker.</w:t>
+      </w:r>
+    </w:p>
+    <w:p>
+      <w:pPr>
+        <w:spacing w:before="0" w:after="40" w:line="240" w:lineRule="auto"/>
+      </w:pPr>
+      <w:r>
+        <w:rPr>
+          <w:rFonts w:ascii="Calibri" w:hAnsi="Calibri" w:cs="Calibri"/>
+          <w:b w:val="0"/>
+          <w:color w:val="1C1F24"/>
+          <w:sz w:val="22"/>
+        </w:rPr>
+        <w:t>Developed and performed training in automated testing for over 100 developers.</w:t>
+      </w:r>
+    </w:p>
+    <w:p>
+      <w:pPr>
+        <w:spacing w:before="0" w:after="40" w:line="240" w:lineRule="auto"/>
+      </w:pPr>
+      <w:r>
+        <w:rPr>
+          <w:rFonts w:ascii="Calibri" w:hAnsi="Calibri" w:cs="Calibri"/>
+          <w:b w:val="0"/>
+          <w:color w:val="1C1F24"/>
+          <w:sz w:val="22"/>
+        </w:rPr>
+        <w:t>Fixed vulnerabilities such as unauthenticated access and SQL injection, applying skills from security training.</w:t>
+      </w:r>
+    </w:p>
+    <w:p>
+      <w:pPr>
+        <w:spacing w:before="160" w:after="20" w:line="240" w:lineRule="auto"/>
+        <w:pBdr>
+          <w:bottom w:val="single" w:sz="8" w:space="1" w:color="1C1F24"/>
+        </w:pBdr>
+      </w:pPr>
+      <w:r>
+        <w:rPr>
+          <w:rFonts w:ascii="Calibri" w:hAnsi="Calibri" w:cs="Calibri"/>
+          <w:b/>
+          <w:color w:val="1C1F24"/>
+          <w:sz w:val="22"/>
+        </w:rPr>
+        <w:t>CERTIFICATIONS</w:t>
+      </w:r>
+    </w:p>
+    <w:p>
+      <w:pPr>
+        <w:spacing w:before="20" w:after="20" w:line="240" w:lineRule="auto"/>
+      </w:pPr>
+      <w:hyperlink r:id="rId13">
+        <w:r>
+          <w:rPr>
+            <w:rFonts w:ascii="Calibri" w:hAnsi="Calibri" w:cs="Calibri"/>
+            <w:sz w:val="22"/>
+            <w:szCs w:val="22"/>
+            <w:color w:val="1F4B6E"/>
+            <w:u w:val="single"/>
+          </w:rPr>
+          <w:t xml:space="preserve">DEV541: SANS Secure Coding in Java/JEE: Developing Defensible Applications</w:t>
+        </w:r>
+      </w:hyperlink>
+      <w:r>
+        <w:rPr>
+          <w:rFonts w:ascii="Calibri" w:hAnsi="Calibri" w:cs="Calibri"/>
+          <w:b w:val="0"/>
+          <w:color w:val="1C1F24"/>
+          <w:sz w:val="21"/>
+        </w:rPr>
+        <w:t xml:space="preserve">  April 2019 (certified August 2019)</w:t>
+      </w:r>
+    </w:p>
+    <w:p>
+      <w:pPr>
+        <w:spacing w:before="20" w:after="20" w:line="240" w:lineRule="auto"/>
+      </w:pPr>
+      <w:hyperlink r:id="rId14">
+        <w:r>
+          <w:rPr>
+            <w:rFonts w:ascii="Calibri" w:hAnsi="Calibri" w:cs="Calibri"/>
+            <w:sz w:val="22"/>
+            <w:szCs w:val="22"/>
+            <w:color w:val="1F4B6E"/>
+            <w:u w:val="single"/>
+          </w:rPr>
+          <w:t xml:space="preserve">DEV544: SANS Secure Coding in .NET: Developing Defensible Applications</w:t>
+        </w:r>
+      </w:hyperlink>
+      <w:r>
+        <w:rPr>
+          <w:rFonts w:ascii="Calibri" w:hAnsi="Calibri" w:cs="Calibri"/>
+          <w:b w:val="0"/>
+          <w:color w:val="1C1F24"/>
+          <w:sz w:val="21"/>
+        </w:rPr>
+        <w:t xml:space="preserve">  April 2018 (certified August 2018)</w:t>
+      </w:r>
+    </w:p>
+    <w:p>
+      <w:pPr>
+        <w:spacing w:before="160" w:after="20" w:line="240" w:lineRule="auto"/>
         <w:pBdr>
           <w:bottom w:val="single" w:sz="8" w:space="1" w:color="1C1F24"/>
         </w:pBdr>
@@ -223,7 +313,7 @@
     </w:p>
     <w:p>
       <w:pPr>
-        <w:spacing w:before="240" w:after="40" w:line="240" w:lineRule="auto"/>
+        <w:spacing w:before="160" w:after="20" w:line="240" w:lineRule="auto"/>
         <w:pBdr>
           <w:bottom w:val="single" w:sz="8" w:space="1" w:color="1C1F24"/>
         </w:pBdr>
@@ -238,69 +328,39 @@
         <w:t>WORK EXPERIENCE</w:t>
       </w:r>
     </w:p>
-    <w:tbl>
-      <w:tblPr>
-        <w:tblW w:type="auto" w:w="0"/>
-        <w:tblLayout w:type="fixed"/>
-        <w:tblLook w:firstColumn="1" w:firstRow="1" w:lastColumn="0" w:lastRow="0" w:noHBand="0" w:noVBand="1" w:val="04A0"/>
-        <w:tblBorders>
-          <w:top w:val="nil"/>
-          <w:left w:val="nil"/>
-          <w:bottom w:val="nil"/>
-          <w:right w:val="nil"/>
-          <w:insideH w:val="nil"/>
-          <w:insideV w:val="nil"/>
-        </w:tblBorders>
-      </w:tblPr>
-      <w:tblGrid>
-        <w:gridCol w:w="5112"/>
-        <w:gridCol w:w="5112"/>
-      </w:tblGrid>
-      <w:tr>
-        <w:tc>
-          <w:tcPr>
-            <w:tcW w:type="dxa" w:w="7704"/>
-          </w:tcPr>
-          <w:p>
-            <w:pPr>
-              <w:spacing w:before="0" w:after="0" w:line="240" w:lineRule="auto"/>
-            </w:pPr>
-            <w:r>
-              <w:rPr>
-                <w:rFonts w:ascii="Calibri" w:hAnsi="Calibri" w:cs="Calibri"/>
-                <w:b/>
-                <w:color w:val="1C1F24"/>
-                <w:sz w:val="22"/>
-              </w:rPr>
-              <w:t>Solution Architect</w:t>
-            </w:r>
-          </w:p>
-        </w:tc>
-        <w:tc>
-          <w:tcPr>
-            <w:tcW w:type="dxa" w:w="2520"/>
-          </w:tcPr>
-          <w:p>
-            <w:pPr>
-              <w:spacing w:before="0" w:after="0" w:line="240" w:lineRule="auto"/>
-              <w:jc w:val="right"/>
-            </w:pPr>
-            <w:r>
-              <w:rPr>
-                <w:rFonts w:ascii="Calibri" w:hAnsi="Calibri" w:cs="Calibri"/>
-                <w:b w:val="0"/>
-                <w:color w:val="1C1F24"/>
-                <w:sz w:val="22"/>
-              </w:rPr>
-              <w:t>Sep 2023 – Present</w:t>
-            </w:r>
-          </w:p>
-        </w:tc>
-      </w:tr>
-    </w:tbl>
     <w:p>
       <w:pPr>
-        <w:spacing w:before="0" w:after="40" w:line="240" w:lineRule="auto"/>
+        <w:tabs>
+          <w:tab w:pos="10368" w:val="right"/>
+        </w:tabs>
+        <w:spacing w:before="60" w:after="0" w:line="240" w:lineRule="auto"/>
+      </w:pPr>
+      <w:r>
+        <w:rPr>
+          <w:rFonts w:ascii="Calibri" w:hAnsi="Calibri" w:cs="Calibri"/>
+          <w:b/>
+          <w:color w:val="1C1F24"/>
+          <w:sz w:val="22"/>
+        </w:rPr>
+        <w:t>Solution Architect, Mad Mobile, Tampa, FL</w:t>
+      </w:r>
+      <w:r>
+        <w:rPr>
+          <w:rFonts w:ascii="Calibri" w:hAnsi="Calibri" w:cs="Calibri"/>
+          <w:b w:val="0"/>
+          <w:color w:val="1C1F24"/>
+          <w:sz w:val="22"/>
+        </w:rPr>
+        <w:tab/>
+        <w:t>Sep 2023 – Present</w:t>
+      </w:r>
+    </w:p>
+    <w:p>
+      <w:pPr>
+        <w:tabs>
+          <w:tab w:pos="10368" w:val="right"/>
+        </w:tabs>
+        <w:spacing w:before="0" w:after="0" w:line="240" w:lineRule="auto"/>
       </w:pPr>
       <w:r>
         <w:rPr>
@@ -309,14 +369,160 @@
           <w:color w:val="1C1F24"/>
           <w:sz w:val="21"/>
         </w:rPr>
-        <w:t>Mad Mobile, Tampa, FL · Restaurant and Retail Software</w:t>
+        <w:t>Restaurant and Retail Software</w:t>
       </w:r>
     </w:p>
     <w:p>
       <w:pPr>
         <w:pStyle w:val="ListBullet"/>
-        <w:spacing w:before="0" w:after="20" w:line="240" w:lineRule="auto"/>
+        <w:spacing w:before="0" w:after="0" w:line="240" w:lineRule="auto"/>
       </w:pPr>
+      <w:r>
+        <w:rPr>
+          <w:rFonts w:ascii="Calibri" w:hAnsi="Calibri" w:cs="Calibri"/>
+          <w:b w:val="0"/>
+          <w:color w:val="1C1F24"/>
+          <w:sz w:val="21"/>
+        </w:rPr>
+        <w:t>Standardize build automation, Snyk security testing, unit and integration tests, code review, release versioning, and deployment automation across old and new applications</w:t>
+      </w:r>
+    </w:p>
+    <w:p>
+      <w:pPr>
+        <w:pStyle w:val="ListBullet"/>
+        <w:spacing w:before="0" w:after="0" w:line="240" w:lineRule="auto"/>
+      </w:pPr>
+      <w:r>
+        <w:rPr>
+          <w:rFonts w:ascii="Calibri" w:hAnsi="Calibri" w:cs="Calibri"/>
+          <w:b w:val="0"/>
+          <w:color w:val="1C1F24"/>
+          <w:sz w:val="21"/>
+        </w:rPr>
+        <w:t>Rewrite ShopCPQ in NestJS, replacing MongoDB queues with RabbitMQ and in-memory timers with Kubernetes jobs</w:t>
+      </w:r>
+    </w:p>
+    <w:p>
+      <w:pPr>
+        <w:pStyle w:val="ListBullet"/>
+        <w:spacing w:before="0" w:after="0" w:line="240" w:lineRule="auto"/>
+      </w:pPr>
+      <w:r>
+        <w:rPr>
+          <w:rFonts w:ascii="Calibri" w:hAnsi="Calibri" w:cs="Calibri"/>
+          <w:b w:val="0"/>
+          <w:color w:val="1C1F24"/>
+          <w:sz w:val="21"/>
+        </w:rPr>
+        <w:t>Make JSDoc type safety and unit test coverage standard for JSRunner implementation repositories</w:t>
+      </w:r>
+    </w:p>
+    <w:p>
+      <w:pPr>
+        <w:pStyle w:val="ListBullet"/>
+        <w:spacing w:before="0" w:after="0" w:line="240" w:lineRule="auto"/>
+      </w:pPr>
+      <w:r>
+        <w:rPr>
+          <w:rFonts w:ascii="Calibri" w:hAnsi="Calibri" w:cs="Calibri"/>
+          <w:b w:val="0"/>
+          <w:color w:val="1C1F24"/>
+          <w:sz w:val="21"/>
+        </w:rPr>
+        <w:t>Guide integration choices across n8n, Prismatic, and NestJS while supporting retail customers such as Knitwell Group and West Marine</w:t>
+      </w:r>
+    </w:p>
+    <w:p>
+      <w:pPr>
+        <w:pStyle w:val="ListBullet"/>
+        <w:spacing w:before="0" w:after="0" w:line="240" w:lineRule="auto"/>
+      </w:pPr>
+      <w:r>
+        <w:rPr>
+          <w:rFonts w:ascii="Calibri" w:hAnsi="Calibri" w:cs="Calibri"/>
+          <w:b w:val="0"/>
+          <w:color w:val="1C1F24"/>
+          <w:sz w:val="21"/>
+        </w:rPr>
+        <w:t>Carry OAuth research for Concierge through to an implementation decision, and steer Concierge toward faster client integration, including Concierge AI</w:t>
+      </w:r>
+    </w:p>
+    <w:p>
+      <w:pPr>
+        <w:pStyle w:val="ListBullet"/>
+        <w:spacing w:before="0" w:after="0" w:line="240" w:lineRule="auto"/>
+      </w:pPr>
+      <w:r>
+        <w:rPr>
+          <w:rFonts w:ascii="Calibri" w:hAnsi="Calibri" w:cs="Calibri"/>
+          <w:b w:val="0"/>
+          <w:color w:val="1C1F24"/>
+          <w:sz w:val="21"/>
+        </w:rPr>
+        <w:t>Move Neo toward reproducible builds and deployments</w:t>
+      </w:r>
+    </w:p>
+    <w:p>
+      <w:pPr>
+        <w:pStyle w:val="ListBullet"/>
+        <w:spacing w:before="0" w:after="0" w:line="240" w:lineRule="auto"/>
+      </w:pPr>
+      <w:r>
+        <w:rPr>
+          <w:rFonts w:ascii="Calibri" w:hAnsi="Calibri" w:cs="Calibri"/>
+          <w:b w:val="0"/>
+          <w:color w:val="1C1F24"/>
+          <w:sz w:val="21"/>
+        </w:rPr>
+        <w:t>Partner with the Cloud team on production ownership, with a clear split between prod and non-prod and explicit access controls</w:t>
+      </w:r>
+    </w:p>
+    <w:p>
+      <w:pPr>
+        <w:pStyle w:val="ListBullet"/>
+        <w:spacing w:before="0" w:after="0" w:line="240" w:lineRule="auto"/>
+      </w:pPr>
+      <w:r>
+        <w:rPr>
+          <w:rFonts w:ascii="Calibri" w:hAnsi="Calibri" w:cs="Calibri"/>
+          <w:b w:val="0"/>
+          <w:color w:val="1C1F24"/>
+          <w:sz w:val="21"/>
+        </w:rPr>
+        <w:t>Support Multi-Location Reporting, Enterprise Solutions, and products including CAKE, MenuPad, and Concierge</w:t>
+      </w:r>
+    </w:p>
+    <w:p>
+      <w:pPr>
+        <w:pStyle w:val="ListBullet"/>
+        <w:spacing w:before="0" w:after="0" w:line="240" w:lineRule="auto"/>
+      </w:pPr>
+      <w:r>
+        <w:rPr>
+          <w:rFonts w:ascii="Calibri" w:hAnsi="Calibri" w:cs="Calibri"/>
+          <w:b w:val="0"/>
+          <w:color w:val="1C1F24"/>
+          <w:sz w:val="21"/>
+        </w:rPr>
+        <w:t>Mentor retail engineers and advocate for simple, maintainable architecture in design decisions</w:t>
+      </w:r>
+    </w:p>
+    <w:p>
+      <w:pPr>
+        <w:tabs>
+          <w:tab w:pos="10368" w:val="right"/>
+        </w:tabs>
+        <w:spacing w:before="60" w:after="0" w:line="240" w:lineRule="auto"/>
+      </w:pPr>
+      <w:r>
+        <w:rPr>
+          <w:rFonts w:ascii="Calibri" w:hAnsi="Calibri" w:cs="Calibri"/>
+          <w:b/>
+          <w:color w:val="1C1F24"/>
+          <w:sz w:val="22"/>
+        </w:rPr>
+        <w:t>Senior Software Developer (Contractor)</w:t>
+      </w:r>
       <w:r>
         <w:rPr>
           <w:rFonts w:ascii="Calibri" w:hAnsi="Calibri" w:cs="Calibri"/>
@@ -324,192 +530,16 @@
           <w:color w:val="1C1F24"/>
           <w:sz w:val="22"/>
         </w:rPr>
-        <w:t>Standardize build automation, Snyk security testing, unit and integration tests, code review, release versioning, and deployment automation across old and new applications</w:t>
+        <w:tab/>
+        <w:t>Jan 2019 – Present (part-time since Aug 2023)</w:t>
       </w:r>
     </w:p>
     <w:p>
       <w:pPr>
-        <w:pStyle w:val="ListBullet"/>
-        <w:spacing w:before="0" w:after="20" w:line="240" w:lineRule="auto"/>
-      </w:pPr>
-      <w:r>
-        <w:rPr>
-          <w:rFonts w:ascii="Calibri" w:hAnsi="Calibri" w:cs="Calibri"/>
-          <w:b w:val="0"/>
-          <w:color w:val="1C1F24"/>
-          <w:sz w:val="22"/>
-        </w:rPr>
-        <w:t>Rewrite ShopCPQ in NestJS, replacing MongoDB queues with RabbitMQ and in-memory timers with Kubernetes jobs</w:t>
-      </w:r>
-    </w:p>
-    <w:p>
-      <w:pPr>
-        <w:pStyle w:val="ListBullet"/>
-        <w:spacing w:before="0" w:after="20" w:line="240" w:lineRule="auto"/>
-      </w:pPr>
-      <w:r>
-        <w:rPr>
-          <w:rFonts w:ascii="Calibri" w:hAnsi="Calibri" w:cs="Calibri"/>
-          <w:b w:val="0"/>
-          <w:color w:val="1C1F24"/>
-          <w:sz w:val="22"/>
-        </w:rPr>
-        <w:t>Make JSDoc type safety and unit test coverage standard for JSRunner implementation repositories</w:t>
-      </w:r>
-    </w:p>
-    <w:p>
-      <w:pPr>
-        <w:pStyle w:val="ListBullet"/>
-        <w:spacing w:before="0" w:after="20" w:line="240" w:lineRule="auto"/>
-      </w:pPr>
-      <w:r>
-        <w:rPr>
-          <w:rFonts w:ascii="Calibri" w:hAnsi="Calibri" w:cs="Calibri"/>
-          <w:b w:val="0"/>
-          <w:color w:val="1C1F24"/>
-          <w:sz w:val="22"/>
-        </w:rPr>
-        <w:t>Guide integration choices across n8n, Prismatic, and NestJS while supporting retail customers such as Knitwell Group and West Marine</w:t>
-      </w:r>
-    </w:p>
-    <w:p>
-      <w:pPr>
-        <w:pStyle w:val="ListBullet"/>
-        <w:spacing w:before="0" w:after="20" w:line="240" w:lineRule="auto"/>
-      </w:pPr>
-      <w:r>
-        <w:rPr>
-          <w:rFonts w:ascii="Calibri" w:hAnsi="Calibri" w:cs="Calibri"/>
-          <w:b w:val="0"/>
-          <w:color w:val="1C1F24"/>
-          <w:sz w:val="22"/>
-        </w:rPr>
-        <w:t>Carry OAuth research for Concierge through to an implementation decision, and steer Concierge toward faster client integration, including Concierge AI</w:t>
-      </w:r>
-    </w:p>
-    <w:p>
-      <w:pPr>
-        <w:pStyle w:val="ListBullet"/>
-        <w:spacing w:before="0" w:after="20" w:line="240" w:lineRule="auto"/>
-      </w:pPr>
-      <w:r>
-        <w:rPr>
-          <w:rFonts w:ascii="Calibri" w:hAnsi="Calibri" w:cs="Calibri"/>
-          <w:b w:val="0"/>
-          <w:color w:val="1C1F24"/>
-          <w:sz w:val="22"/>
-        </w:rPr>
-        <w:t>Move Neo toward reproducible builds and deployments</w:t>
-      </w:r>
-    </w:p>
-    <w:p>
-      <w:pPr>
-        <w:pStyle w:val="ListBullet"/>
-        <w:spacing w:before="0" w:after="20" w:line="240" w:lineRule="auto"/>
-      </w:pPr>
-      <w:r>
-        <w:rPr>
-          <w:rFonts w:ascii="Calibri" w:hAnsi="Calibri" w:cs="Calibri"/>
-          <w:b w:val="0"/>
-          <w:color w:val="1C1F24"/>
-          <w:sz w:val="22"/>
-        </w:rPr>
-        <w:t>Partner with the Cloud team on production ownership, with a clear split between prod and non-prod and explicit access controls</w:t>
-      </w:r>
-    </w:p>
-    <w:p>
-      <w:pPr>
-        <w:pStyle w:val="ListBullet"/>
-        <w:spacing w:before="0" w:after="20" w:line="240" w:lineRule="auto"/>
-      </w:pPr>
-      <w:r>
-        <w:rPr>
-          <w:rFonts w:ascii="Calibri" w:hAnsi="Calibri" w:cs="Calibri"/>
-          <w:b w:val="0"/>
-          <w:color w:val="1C1F24"/>
-          <w:sz w:val="22"/>
-        </w:rPr>
-        <w:t>Support Multi-Location Reporting, Enterprise Solutions, and products including CAKE, MenuPad, and Concierge</w:t>
-      </w:r>
-    </w:p>
-    <w:p>
-      <w:pPr>
-        <w:pStyle w:val="ListBullet"/>
-        <w:spacing w:before="0" w:after="20" w:line="240" w:lineRule="auto"/>
-      </w:pPr>
-      <w:r>
-        <w:rPr>
-          <w:rFonts w:ascii="Calibri" w:hAnsi="Calibri" w:cs="Calibri"/>
-          <w:b w:val="0"/>
-          <w:color w:val="1C1F24"/>
-          <w:sz w:val="22"/>
-        </w:rPr>
-        <w:t>Mentor retail engineers and advocate for simple, maintainable architecture in design decisions</w:t>
-      </w:r>
-    </w:p>
-    <w:tbl>
-      <w:tblPr>
-        <w:tblW w:type="auto" w:w="0"/>
-        <w:tblLayout w:type="fixed"/>
-        <w:tblLook w:firstColumn="1" w:firstRow="1" w:lastColumn="0" w:lastRow="0" w:noHBand="0" w:noVBand="1" w:val="04A0"/>
-        <w:tblBorders>
-          <w:top w:val="nil"/>
-          <w:left w:val="nil"/>
-          <w:bottom w:val="nil"/>
-          <w:right w:val="nil"/>
-          <w:insideH w:val="nil"/>
-          <w:insideV w:val="nil"/>
-        </w:tblBorders>
-      </w:tblPr>
-      <w:tblGrid>
-        <w:gridCol w:w="5112"/>
-        <w:gridCol w:w="5112"/>
-      </w:tblGrid>
-      <w:tr>
-        <w:tc>
-          <w:tcPr>
-            <w:tcW w:type="dxa" w:w="7704"/>
-          </w:tcPr>
-          <w:p>
-            <w:pPr>
-              <w:spacing w:before="0" w:after="0" w:line="240" w:lineRule="auto"/>
-            </w:pPr>
-            <w:r>
-              <w:rPr>
-                <w:rFonts w:ascii="Calibri" w:hAnsi="Calibri" w:cs="Calibri"/>
-                <w:b/>
-                <w:color w:val="1C1F24"/>
-                <w:sz w:val="22"/>
-              </w:rPr>
-              <w:t>Senior Software Developer (Contractor)</w:t>
-            </w:r>
-          </w:p>
-        </w:tc>
-        <w:tc>
-          <w:tcPr>
-            <w:tcW w:type="dxa" w:w="2520"/>
-          </w:tcPr>
-          <w:p>
-            <w:pPr>
-              <w:spacing w:before="0" w:after="0" w:line="240" w:lineRule="auto"/>
-              <w:jc w:val="right"/>
-            </w:pPr>
-            <w:r>
-              <w:rPr>
-                <w:rFonts w:ascii="Calibri" w:hAnsi="Calibri" w:cs="Calibri"/>
-                <w:b w:val="0"/>
-                <w:color w:val="1C1F24"/>
-                <w:sz w:val="22"/>
-              </w:rPr>
-              <w:t>Jan 2019 – Present (part-time since Aug 2023)</w:t>
-            </w:r>
-          </w:p>
-        </w:tc>
-      </w:tr>
-    </w:tbl>
-    <w:p>
-      <w:pPr>
-        <w:spacing w:before="0" w:after="40" w:line="240" w:lineRule="auto"/>
+        <w:tabs>
+          <w:tab w:pos="10368" w:val="right"/>
+        </w:tabs>
+        <w:spacing w:before="0" w:after="0" w:line="240" w:lineRule="auto"/>
       </w:pPr>
       <w:r>
         <w:rPr>
@@ -524,231 +554,7 @@
     <w:p>
       <w:pPr>
         <w:pStyle w:val="ListBullet"/>
-        <w:spacing w:before="0" w:after="20" w:line="240" w:lineRule="auto"/>
-      </w:pPr>
-      <w:r>
-        <w:rPr>
-          <w:rFonts w:ascii="Calibri" w:hAnsi="Calibri" w:cs="Calibri"/>
-          <w:b w:val="0"/>
-          <w:color w:val="1C1F24"/>
-          <w:sz w:val="22"/>
-        </w:rPr>
-        <w:t>Design automatic API documentation from unit test execution</w:t>
-      </w:r>
-    </w:p>
-    <w:p>
-      <w:pPr>
-        <w:pStyle w:val="ListBullet"/>
-        <w:spacing w:before="0" w:after="20" w:line="240" w:lineRule="auto"/>
-      </w:pPr>
-      <w:r>
-        <w:rPr>
-          <w:rFonts w:ascii="Calibri" w:hAnsi="Calibri" w:cs="Calibri"/>
-          <w:b w:val="0"/>
-          <w:color w:val="1C1F24"/>
-          <w:sz w:val="22"/>
-        </w:rPr>
-        <w:t>Create SAML Identify Provider on existing authentication system</w:t>
-      </w:r>
-    </w:p>
-    <w:p>
-      <w:pPr>
-        <w:pStyle w:val="ListBullet"/>
-        <w:spacing w:before="0" w:after="20" w:line="240" w:lineRule="auto"/>
-      </w:pPr>
-      <w:r>
-        <w:rPr>
-          <w:rFonts w:ascii="Calibri" w:hAnsi="Calibri" w:cs="Calibri"/>
-          <w:b w:val="0"/>
-          <w:color w:val="1C1F24"/>
-          <w:sz w:val="22"/>
-        </w:rPr>
-        <w:t>Develop and maintain Azure Functions, ASP.NET Core/MVC and SOAP services (C#)</w:t>
-      </w:r>
-    </w:p>
-    <w:p>
-      <w:pPr>
-        <w:pStyle w:val="ListBullet"/>
-        <w:spacing w:before="0" w:after="20" w:line="240" w:lineRule="auto"/>
-      </w:pPr>
-      <w:r>
-        <w:rPr>
-          <w:rFonts w:ascii="Calibri" w:hAnsi="Calibri" w:cs="Calibri"/>
-          <w:b w:val="0"/>
-          <w:color w:val="1C1F24"/>
-          <w:sz w:val="22"/>
-        </w:rPr>
-        <w:t>Encourage best practices (e.g. SOLID, clean code, etc) and use of DI for IoC in .NET</w:t>
-      </w:r>
-    </w:p>
-    <w:p>
-      <w:pPr>
-        <w:pStyle w:val="ListBullet"/>
-        <w:spacing w:before="0" w:after="20" w:line="240" w:lineRule="auto"/>
-      </w:pPr>
-      <w:r>
-        <w:rPr>
-          <w:rFonts w:ascii="Calibri" w:hAnsi="Calibri" w:cs="Calibri"/>
-          <w:b w:val="0"/>
-          <w:color w:val="1C1F24"/>
-          <w:sz w:val="22"/>
-        </w:rPr>
-        <w:t>Optimize REST services from controller to database via LINQ and EF Core</w:t>
-      </w:r>
-    </w:p>
-    <w:p>
-      <w:pPr>
-        <w:pStyle w:val="ListBullet"/>
-        <w:spacing w:before="0" w:after="20" w:line="240" w:lineRule="auto"/>
-      </w:pPr>
-      <w:r>
-        <w:rPr>
-          <w:rFonts w:ascii="Calibri" w:hAnsi="Calibri" w:cs="Calibri"/>
-          <w:b w:val="0"/>
-          <w:color w:val="1C1F24"/>
-          <w:sz w:val="22"/>
-        </w:rPr>
-        <w:t>Convert UI pages from jQuery to React and JavaScript to TypeScript</w:t>
-      </w:r>
-    </w:p>
-    <w:p>
-      <w:pPr>
-        <w:pStyle w:val="ListBullet"/>
-        <w:spacing w:before="0" w:after="20" w:line="240" w:lineRule="auto"/>
-      </w:pPr>
-      <w:r>
-        <w:rPr>
-          <w:rFonts w:ascii="Calibri" w:hAnsi="Calibri" w:cs="Calibri"/>
-          <w:b w:val="0"/>
-          <w:color w:val="1C1F24"/>
-          <w:sz w:val="22"/>
-        </w:rPr>
-        <w:t>Consolidate source code repositories and CI/CD solutions for automated testing/linting</w:t>
-      </w:r>
-    </w:p>
-    <w:p>
-      <w:pPr>
-        <w:pStyle w:val="ListBullet"/>
-        <w:spacing w:before="0" w:after="20" w:line="240" w:lineRule="auto"/>
-      </w:pPr>
-      <w:r>
-        <w:rPr>
-          <w:rFonts w:ascii="Calibri" w:hAnsi="Calibri" w:cs="Calibri"/>
-          <w:b w:val="0"/>
-          <w:color w:val="1C1F24"/>
-          <w:sz w:val="22"/>
-        </w:rPr>
-        <w:t>Automate builds using Azure DevOps Build and Release Pipelines</w:t>
-      </w:r>
-    </w:p>
-    <w:p>
-      <w:pPr>
-        <w:pStyle w:val="ListBullet"/>
-        <w:spacing w:before="0" w:after="20" w:line="240" w:lineRule="auto"/>
-      </w:pPr>
-      <w:r>
-        <w:rPr>
-          <w:rFonts w:ascii="Calibri" w:hAnsi="Calibri" w:cs="Calibri"/>
-          <w:b w:val="0"/>
-          <w:color w:val="1C1F24"/>
-          <w:sz w:val="22"/>
-        </w:rPr>
-        <w:t>Integrate ARM templates to streamline deployments</w:t>
-      </w:r>
-    </w:p>
-    <w:p>
-      <w:pPr>
-        <w:pStyle w:val="ListBullet"/>
-        <w:spacing w:before="0" w:after="20" w:line="240" w:lineRule="auto"/>
-      </w:pPr>
-      <w:r>
-        <w:rPr>
-          <w:rFonts w:ascii="Calibri" w:hAnsi="Calibri" w:cs="Calibri"/>
-          <w:b w:val="0"/>
-          <w:color w:val="1C1F24"/>
-          <w:sz w:val="22"/>
-        </w:rPr>
-        <w:t>Alert and troubleshoot using Azure App Insights' KQL (Kusto Query Language)</w:t>
-      </w:r>
-    </w:p>
-    <w:p>
-      <w:pPr>
-        <w:pStyle w:val="ListBullet"/>
-        <w:spacing w:before="0" w:after="20" w:line="240" w:lineRule="auto"/>
-      </w:pPr>
-      <w:r>
-        <w:rPr>
-          <w:rFonts w:ascii="Calibri" w:hAnsi="Calibri" w:cs="Calibri"/>
-          <w:b w:val="0"/>
-          <w:color w:val="1C1F24"/>
-          <w:sz w:val="22"/>
-        </w:rPr>
-        <w:t>Update stored procedures (SQL Server) and write SQL unit tests to verify functionality</w:t>
-      </w:r>
-    </w:p>
-    <w:tbl>
-      <w:tblPr>
-        <w:tblW w:type="auto" w:w="0"/>
-        <w:tblLayout w:type="fixed"/>
-        <w:tblLook w:firstColumn="1" w:firstRow="1" w:lastColumn="0" w:lastRow="0" w:noHBand="0" w:noVBand="1" w:val="04A0"/>
-        <w:tblBorders>
-          <w:top w:val="nil"/>
-          <w:left w:val="nil"/>
-          <w:bottom w:val="nil"/>
-          <w:right w:val="nil"/>
-          <w:insideH w:val="nil"/>
-          <w:insideV w:val="nil"/>
-        </w:tblBorders>
-      </w:tblPr>
-      <w:tblGrid>
-        <w:gridCol w:w="5112"/>
-        <w:gridCol w:w="5112"/>
-      </w:tblGrid>
-      <w:tr>
-        <w:tc>
-          <w:tcPr>
-            <w:tcW w:type="dxa" w:w="7704"/>
-          </w:tcPr>
-          <w:p>
-            <w:pPr>
-              <w:spacing w:before="0" w:after="0" w:line="240" w:lineRule="auto"/>
-            </w:pPr>
-            <w:r>
-              <w:rPr>
-                <w:rFonts w:ascii="Calibri" w:hAnsi="Calibri" w:cs="Calibri"/>
-                <w:b/>
-                <w:color w:val="1C1F24"/>
-                <w:sz w:val="22"/>
-              </w:rPr>
-              <w:t>Senior Software Developer (Contractor)</w:t>
-            </w:r>
-          </w:p>
-        </w:tc>
-        <w:tc>
-          <w:tcPr>
-            <w:tcW w:type="dxa" w:w="2520"/>
-          </w:tcPr>
-          <w:p>
-            <w:pPr>
-              <w:spacing w:before="0" w:after="0" w:line="240" w:lineRule="auto"/>
-              <w:jc w:val="right"/>
-            </w:pPr>
-            <w:r>
-              <w:rPr>
-                <w:rFonts w:ascii="Calibri" w:hAnsi="Calibri" w:cs="Calibri"/>
-                <w:b w:val="0"/>
-                <w:color w:val="1C1F24"/>
-                <w:sz w:val="22"/>
-              </w:rPr>
-              <w:t>Jun 2021 – Sep 2023</w:t>
-            </w:r>
-          </w:p>
-        </w:tc>
-      </w:tr>
-    </w:tbl>
-    <w:p>
-      <w:pPr>
-        <w:spacing w:before="0" w:after="40" w:line="240" w:lineRule="auto"/>
+        <w:spacing w:before="0" w:after="0" w:line="240" w:lineRule="auto"/>
       </w:pPr>
       <w:r>
         <w:rPr>
@@ -757,177 +563,13 @@
           <w:color w:val="1C1F24"/>
           <w:sz w:val="21"/>
         </w:rPr>
-        <w:t>Flexsible, Tampa, FL · Smart Contract Development Services</w:t>
+        <w:t>Design automatic API documentation from unit test execution</w:t>
       </w:r>
     </w:p>
     <w:p>
       <w:pPr>
         <w:pStyle w:val="ListBullet"/>
-        <w:spacing w:before="0" w:after="20" w:line="240" w:lineRule="auto"/>
-      </w:pPr>
-      <w:r>
-        <w:rPr>
-          <w:rFonts w:ascii="Calibri" w:hAnsi="Calibri" w:cs="Calibri"/>
-          <w:b w:val="0"/>
-          <w:color w:val="1C1F24"/>
-          <w:sz w:val="22"/>
-        </w:rPr>
-        <w:t>Create Smart Contract using Solidity and HardHat including automated unit tests</w:t>
-      </w:r>
-    </w:p>
-    <w:p>
-      <w:pPr>
-        <w:pStyle w:val="ListBullet"/>
-        <w:spacing w:before="0" w:after="20" w:line="240" w:lineRule="auto"/>
-      </w:pPr>
-      <w:r>
-        <w:rPr>
-          <w:rFonts w:ascii="Calibri" w:hAnsi="Calibri" w:cs="Calibri"/>
-          <w:b w:val="0"/>
-          <w:color w:val="1C1F24"/>
-          <w:sz w:val="22"/>
-        </w:rPr>
-        <w:t>Reduce gas by implementing cloning of Smart Contracts</w:t>
-      </w:r>
-    </w:p>
-    <w:p>
-      <w:pPr>
-        <w:pStyle w:val="ListBullet"/>
-        <w:spacing w:before="0" w:after="20" w:line="240" w:lineRule="auto"/>
-      </w:pPr>
-      <w:r>
-        <w:rPr>
-          <w:rFonts w:ascii="Calibri" w:hAnsi="Calibri" w:cs="Calibri"/>
-          <w:b w:val="0"/>
-          <w:color w:val="1C1F24"/>
-          <w:sz w:val="22"/>
-        </w:rPr>
-        <w:t>Troubleshoot Hyperledger FireFly dynamic creation of supernodes</w:t>
-      </w:r>
-    </w:p>
-    <w:p>
-      <w:pPr>
-        <w:pStyle w:val="ListBullet"/>
-        <w:spacing w:before="0" w:after="20" w:line="240" w:lineRule="auto"/>
-      </w:pPr>
-      <w:r>
-        <w:rPr>
-          <w:rFonts w:ascii="Calibri" w:hAnsi="Calibri" w:cs="Calibri"/>
-          <w:b w:val="0"/>
-          <w:color w:val="1C1F24"/>
-          <w:sz w:val="22"/>
-        </w:rPr>
-        <w:t>Investigate Proof of Concept for Binance Smart Chain real time notifications</w:t>
-      </w:r>
-    </w:p>
-    <w:p>
-      <w:pPr>
-        <w:pStyle w:val="ListBullet"/>
-        <w:spacing w:before="0" w:after="20" w:line="240" w:lineRule="auto"/>
-      </w:pPr>
-      <w:r>
-        <w:rPr>
-          <w:rFonts w:ascii="Calibri" w:hAnsi="Calibri" w:cs="Calibri"/>
-          <w:b w:val="0"/>
-          <w:color w:val="1C1F24"/>
-          <w:sz w:val="22"/>
-        </w:rPr>
-        <w:t>Implement Smart Contracts using both Truffle and Hardhat (Solidity)</w:t>
-      </w:r>
-    </w:p>
-    <w:p>
-      <w:pPr>
-        <w:pStyle w:val="ListBullet"/>
-        <w:spacing w:before="0" w:after="20" w:line="240" w:lineRule="auto"/>
-      </w:pPr>
-      <w:r>
-        <w:rPr>
-          <w:rFonts w:ascii="Calibri" w:hAnsi="Calibri" w:cs="Calibri"/>
-          <w:b w:val="0"/>
-          <w:color w:val="1C1F24"/>
-          <w:sz w:val="22"/>
-        </w:rPr>
-        <w:t>Automate CI/CD using GitHub Actions and AWS CloudFormation for NodeJS apps</w:t>
-      </w:r>
-    </w:p>
-    <w:p>
-      <w:pPr>
-        <w:pStyle w:val="ListBullet"/>
-        <w:spacing w:before="0" w:after="20" w:line="240" w:lineRule="auto"/>
-      </w:pPr>
-      <w:r>
-        <w:rPr>
-          <w:rFonts w:ascii="Calibri" w:hAnsi="Calibri" w:cs="Calibri"/>
-          <w:b w:val="0"/>
-          <w:color w:val="1C1F24"/>
-          <w:sz w:val="22"/>
-        </w:rPr>
-        <w:t>Provide sample PHP for submitting signed token transfer requests to Ethereum</w:t>
-      </w:r>
-    </w:p>
-    <w:tbl>
-      <w:tblPr>
-        <w:tblW w:type="auto" w:w="0"/>
-        <w:tblLayout w:type="fixed"/>
-        <w:tblLook w:firstColumn="1" w:firstRow="1" w:lastColumn="0" w:lastRow="0" w:noHBand="0" w:noVBand="1" w:val="04A0"/>
-        <w:tblBorders>
-          <w:top w:val="nil"/>
-          <w:left w:val="nil"/>
-          <w:bottom w:val="nil"/>
-          <w:right w:val="nil"/>
-          <w:insideH w:val="nil"/>
-          <w:insideV w:val="nil"/>
-        </w:tblBorders>
-      </w:tblPr>
-      <w:tblGrid>
-        <w:gridCol w:w="5112"/>
-        <w:gridCol w:w="5112"/>
-      </w:tblGrid>
-      <w:tr>
-        <w:tc>
-          <w:tcPr>
-            <w:tcW w:type="dxa" w:w="7704"/>
-          </w:tcPr>
-          <w:p>
-            <w:pPr>
-              <w:spacing w:before="0" w:after="0" w:line="240" w:lineRule="auto"/>
-            </w:pPr>
-            <w:r>
-              <w:rPr>
-                <w:rFonts w:ascii="Calibri" w:hAnsi="Calibri" w:cs="Calibri"/>
-                <w:b/>
-                <w:color w:val="1C1F24"/>
-                <w:sz w:val="22"/>
-              </w:rPr>
-              <w:t>Senior Software Developer</w:t>
-            </w:r>
-          </w:p>
-        </w:tc>
-        <w:tc>
-          <w:tcPr>
-            <w:tcW w:type="dxa" w:w="2520"/>
-          </w:tcPr>
-          <w:p>
-            <w:pPr>
-              <w:spacing w:before="0" w:after="0" w:line="240" w:lineRule="auto"/>
-              <w:jc w:val="right"/>
-            </w:pPr>
-            <w:r>
-              <w:rPr>
-                <w:rFonts w:ascii="Calibri" w:hAnsi="Calibri" w:cs="Calibri"/>
-                <w:b w:val="0"/>
-                <w:color w:val="1C1F24"/>
-                <w:sz w:val="22"/>
-              </w:rPr>
-              <w:t>Jul 2019 – Jul 2021</w:t>
-            </w:r>
-          </w:p>
-        </w:tc>
-      </w:tr>
-    </w:tbl>
-    <w:p>
-      <w:pPr>
-        <w:spacing w:before="0" w:after="40" w:line="240" w:lineRule="auto"/>
+        <w:spacing w:before="0" w:after="0" w:line="240" w:lineRule="auto"/>
       </w:pPr>
       <w:r>
         <w:rPr>
@@ -936,14 +578,160 @@
           <w:color w:val="1C1F24"/>
           <w:sz w:val="21"/>
         </w:rPr>
-        <w:t>PODS, Clearwater, FL · Moving and Storage</w:t>
+        <w:t>Create SAML Identity Provider on existing authentication system</w:t>
       </w:r>
     </w:p>
     <w:p>
       <w:pPr>
         <w:pStyle w:val="ListBullet"/>
-        <w:spacing w:before="0" w:after="20" w:line="240" w:lineRule="auto"/>
+        <w:spacing w:before="0" w:after="0" w:line="240" w:lineRule="auto"/>
       </w:pPr>
+      <w:r>
+        <w:rPr>
+          <w:rFonts w:ascii="Calibri" w:hAnsi="Calibri" w:cs="Calibri"/>
+          <w:b w:val="0"/>
+          <w:color w:val="1C1F24"/>
+          <w:sz w:val="21"/>
+        </w:rPr>
+        <w:t>Develop and maintain Azure Functions, ASP.NET Core/MVC and SOAP services (C#)</w:t>
+      </w:r>
+    </w:p>
+    <w:p>
+      <w:pPr>
+        <w:pStyle w:val="ListBullet"/>
+        <w:spacing w:before="0" w:after="0" w:line="240" w:lineRule="auto"/>
+      </w:pPr>
+      <w:r>
+        <w:rPr>
+          <w:rFonts w:ascii="Calibri" w:hAnsi="Calibri" w:cs="Calibri"/>
+          <w:b w:val="0"/>
+          <w:color w:val="1C1F24"/>
+          <w:sz w:val="21"/>
+        </w:rPr>
+        <w:t>Encourage best practices (e.g. SOLID, clean code, etc) and use of DI for IoC in .NET</w:t>
+      </w:r>
+    </w:p>
+    <w:p>
+      <w:pPr>
+        <w:pStyle w:val="ListBullet"/>
+        <w:spacing w:before="0" w:after="0" w:line="240" w:lineRule="auto"/>
+      </w:pPr>
+      <w:r>
+        <w:rPr>
+          <w:rFonts w:ascii="Calibri" w:hAnsi="Calibri" w:cs="Calibri"/>
+          <w:b w:val="0"/>
+          <w:color w:val="1C1F24"/>
+          <w:sz w:val="21"/>
+        </w:rPr>
+        <w:t>Optimize REST services from controller to database via LINQ and EF Core</w:t>
+      </w:r>
+    </w:p>
+    <w:p>
+      <w:pPr>
+        <w:pStyle w:val="ListBullet"/>
+        <w:spacing w:before="0" w:after="0" w:line="240" w:lineRule="auto"/>
+      </w:pPr>
+      <w:r>
+        <w:rPr>
+          <w:rFonts w:ascii="Calibri" w:hAnsi="Calibri" w:cs="Calibri"/>
+          <w:b w:val="0"/>
+          <w:color w:val="1C1F24"/>
+          <w:sz w:val="21"/>
+        </w:rPr>
+        <w:t>Convert UI pages from jQuery to React and JavaScript to TypeScript</w:t>
+      </w:r>
+    </w:p>
+    <w:p>
+      <w:pPr>
+        <w:pStyle w:val="ListBullet"/>
+        <w:spacing w:before="0" w:after="0" w:line="240" w:lineRule="auto"/>
+      </w:pPr>
+      <w:r>
+        <w:rPr>
+          <w:rFonts w:ascii="Calibri" w:hAnsi="Calibri" w:cs="Calibri"/>
+          <w:b w:val="0"/>
+          <w:color w:val="1C1F24"/>
+          <w:sz w:val="21"/>
+        </w:rPr>
+        <w:t>Consolidate source code repositories and CI/CD solutions for automated testing/linting</w:t>
+      </w:r>
+    </w:p>
+    <w:p>
+      <w:pPr>
+        <w:pStyle w:val="ListBullet"/>
+        <w:spacing w:before="0" w:after="0" w:line="240" w:lineRule="auto"/>
+      </w:pPr>
+      <w:r>
+        <w:rPr>
+          <w:rFonts w:ascii="Calibri" w:hAnsi="Calibri" w:cs="Calibri"/>
+          <w:b w:val="0"/>
+          <w:color w:val="1C1F24"/>
+          <w:sz w:val="21"/>
+        </w:rPr>
+        <w:t>Automate builds using Azure DevOps Build and Release Pipelines</w:t>
+      </w:r>
+    </w:p>
+    <w:p>
+      <w:pPr>
+        <w:pStyle w:val="ListBullet"/>
+        <w:spacing w:before="0" w:after="0" w:line="240" w:lineRule="auto"/>
+      </w:pPr>
+      <w:r>
+        <w:rPr>
+          <w:rFonts w:ascii="Calibri" w:hAnsi="Calibri" w:cs="Calibri"/>
+          <w:b w:val="0"/>
+          <w:color w:val="1C1F24"/>
+          <w:sz w:val="21"/>
+        </w:rPr>
+        <w:t>Integrate ARM templates to streamline deployments</w:t>
+      </w:r>
+    </w:p>
+    <w:p>
+      <w:pPr>
+        <w:pStyle w:val="ListBullet"/>
+        <w:spacing w:before="0" w:after="0" w:line="240" w:lineRule="auto"/>
+      </w:pPr>
+      <w:r>
+        <w:rPr>
+          <w:rFonts w:ascii="Calibri" w:hAnsi="Calibri" w:cs="Calibri"/>
+          <w:b w:val="0"/>
+          <w:color w:val="1C1F24"/>
+          <w:sz w:val="21"/>
+        </w:rPr>
+        <w:t>Alert and troubleshoot using Azure App Insights' KQL (Kusto Query Language)</w:t>
+      </w:r>
+    </w:p>
+    <w:p>
+      <w:pPr>
+        <w:pStyle w:val="ListBullet"/>
+        <w:spacing w:before="0" w:after="0" w:line="240" w:lineRule="auto"/>
+      </w:pPr>
+      <w:r>
+        <w:rPr>
+          <w:rFonts w:ascii="Calibri" w:hAnsi="Calibri" w:cs="Calibri"/>
+          <w:b w:val="0"/>
+          <w:color w:val="1C1F24"/>
+          <w:sz w:val="21"/>
+        </w:rPr>
+        <w:t>Update stored procedures (SQL Server) and write SQL unit tests to verify functionality</w:t>
+      </w:r>
+    </w:p>
+    <w:p>
+      <w:pPr>
+        <w:tabs>
+          <w:tab w:pos="10368" w:val="right"/>
+        </w:tabs>
+        <w:spacing w:before="60" w:after="0" w:line="240" w:lineRule="auto"/>
+      </w:pPr>
+      <w:r>
+        <w:rPr>
+          <w:rFonts w:ascii="Calibri" w:hAnsi="Calibri" w:cs="Calibri"/>
+          <w:b/>
+          <w:color w:val="1C1F24"/>
+          <w:sz w:val="22"/>
+        </w:rPr>
+        <w:t>Senior Software Developer (Contractor), Flexsible, Tampa, FL</w:t>
+      </w:r>
       <w:r>
         <w:rPr>
           <w:rFonts w:ascii="Calibri" w:hAnsi="Calibri" w:cs="Calibri"/>
@@ -951,14 +739,148 @@
           <w:color w:val="1C1F24"/>
           <w:sz w:val="22"/>
         </w:rPr>
-        <w:t>Decouple legacy WCF based applications from Microsoft AX 2009 to enable smooth upgrade from Microsoft AX (C#)</w:t>
+        <w:tab/>
+        <w:t>Jun 2021 – Sep 2023</w:t>
+      </w:r>
+    </w:p>
+    <w:p>
+      <w:pPr>
+        <w:tabs>
+          <w:tab w:pos="10368" w:val="right"/>
+        </w:tabs>
+        <w:spacing w:before="0" w:after="0" w:line="240" w:lineRule="auto"/>
+      </w:pPr>
+      <w:r>
+        <w:rPr>
+          <w:rFonts w:ascii="Calibri" w:hAnsi="Calibri" w:cs="Calibri"/>
+          <w:b w:val="0"/>
+          <w:color w:val="1C1F24"/>
+          <w:sz w:val="21"/>
+        </w:rPr>
+        <w:t>Smart Contract Development Services</w:t>
       </w:r>
     </w:p>
     <w:p>
       <w:pPr>
         <w:pStyle w:val="ListBullet"/>
-        <w:spacing w:before="0" w:after="20" w:line="240" w:lineRule="auto"/>
+        <w:spacing w:before="0" w:after="0" w:line="240" w:lineRule="auto"/>
       </w:pPr>
+      <w:r>
+        <w:rPr>
+          <w:rFonts w:ascii="Calibri" w:hAnsi="Calibri" w:cs="Calibri"/>
+          <w:b w:val="0"/>
+          <w:color w:val="1C1F24"/>
+          <w:sz w:val="21"/>
+        </w:rPr>
+        <w:t>Create Smart Contract using Solidity and HardHat including automated unit tests</w:t>
+      </w:r>
+    </w:p>
+    <w:p>
+      <w:pPr>
+        <w:pStyle w:val="ListBullet"/>
+        <w:spacing w:before="0" w:after="0" w:line="240" w:lineRule="auto"/>
+      </w:pPr>
+      <w:r>
+        <w:rPr>
+          <w:rFonts w:ascii="Calibri" w:hAnsi="Calibri" w:cs="Calibri"/>
+          <w:b w:val="0"/>
+          <w:color w:val="1C1F24"/>
+          <w:sz w:val="21"/>
+        </w:rPr>
+        <w:t>Reduce gas by implementing cloning of Smart Contracts</w:t>
+      </w:r>
+    </w:p>
+    <w:p>
+      <w:pPr>
+        <w:pStyle w:val="ListBullet"/>
+        <w:spacing w:before="0" w:after="0" w:line="240" w:lineRule="auto"/>
+      </w:pPr>
+      <w:r>
+        <w:rPr>
+          <w:rFonts w:ascii="Calibri" w:hAnsi="Calibri" w:cs="Calibri"/>
+          <w:b w:val="0"/>
+          <w:color w:val="1C1F24"/>
+          <w:sz w:val="21"/>
+        </w:rPr>
+        <w:t>Troubleshoot Hyperledger FireFly dynamic creation of supernodes</w:t>
+      </w:r>
+    </w:p>
+    <w:p>
+      <w:pPr>
+        <w:pStyle w:val="ListBullet"/>
+        <w:spacing w:before="0" w:after="0" w:line="240" w:lineRule="auto"/>
+      </w:pPr>
+      <w:r>
+        <w:rPr>
+          <w:rFonts w:ascii="Calibri" w:hAnsi="Calibri" w:cs="Calibri"/>
+          <w:b w:val="0"/>
+          <w:color w:val="1C1F24"/>
+          <w:sz w:val="21"/>
+        </w:rPr>
+        <w:t>Investigate Proof of Concept for Binance Smart Chain real time notifications</w:t>
+      </w:r>
+    </w:p>
+    <w:p>
+      <w:pPr>
+        <w:pStyle w:val="ListBullet"/>
+        <w:spacing w:before="0" w:after="0" w:line="240" w:lineRule="auto"/>
+      </w:pPr>
+      <w:r>
+        <w:rPr>
+          <w:rFonts w:ascii="Calibri" w:hAnsi="Calibri" w:cs="Calibri"/>
+          <w:b w:val="0"/>
+          <w:color w:val="1C1F24"/>
+          <w:sz w:val="21"/>
+        </w:rPr>
+        <w:t>Implement Smart Contracts using both Truffle and Hardhat (Solidity)</w:t>
+      </w:r>
+    </w:p>
+    <w:p>
+      <w:pPr>
+        <w:pStyle w:val="ListBullet"/>
+        <w:spacing w:before="0" w:after="0" w:line="240" w:lineRule="auto"/>
+      </w:pPr>
+      <w:r>
+        <w:rPr>
+          <w:rFonts w:ascii="Calibri" w:hAnsi="Calibri" w:cs="Calibri"/>
+          <w:b w:val="0"/>
+          <w:color w:val="1C1F24"/>
+          <w:sz w:val="21"/>
+        </w:rPr>
+        <w:t>Automate CI/CD using GitHub Actions and AWS CloudFormation for NodeJS apps</w:t>
+      </w:r>
+    </w:p>
+    <w:p>
+      <w:pPr>
+        <w:pStyle w:val="ListBullet"/>
+        <w:spacing w:before="0" w:after="0" w:line="240" w:lineRule="auto"/>
+      </w:pPr>
+      <w:r>
+        <w:rPr>
+          <w:rFonts w:ascii="Calibri" w:hAnsi="Calibri" w:cs="Calibri"/>
+          <w:b w:val="0"/>
+          <w:color w:val="1C1F24"/>
+          <w:sz w:val="21"/>
+        </w:rPr>
+        <w:t>Provide sample PHP for submitting signed token transfer requests to Ethereum</w:t>
+      </w:r>
+    </w:p>
+    <w:p>
+      <w:pPr>
+        <w:tabs>
+          <w:tab w:pos="10368" w:val="right"/>
+        </w:tabs>
+        <w:spacing w:before="60" w:after="0" w:line="240" w:lineRule="auto"/>
+      </w:pPr>
+      <w:r>
+        <w:rPr>
+          <w:rFonts w:ascii="Calibri" w:hAnsi="Calibri" w:cs="Calibri"/>
+          <w:b/>
+          <w:color w:val="1C1F24"/>
+          <w:sz w:val="22"/>
+        </w:rPr>
+        <w:t>Senior Software Developer, PODS, Clearwater, FL</w:t>
+      </w:r>
       <w:r>
         <w:rPr>
           <w:rFonts w:ascii="Calibri" w:hAnsi="Calibri" w:cs="Calibri"/>
@@ -966,14 +888,103 @@
           <w:color w:val="1C1F24"/>
           <w:sz w:val="22"/>
         </w:rPr>
+        <w:tab/>
+        <w:t>Jul 2019 – Jul 2021</w:t>
+      </w:r>
+    </w:p>
+    <w:p>
+      <w:pPr>
+        <w:tabs>
+          <w:tab w:pos="10368" w:val="right"/>
+        </w:tabs>
+        <w:spacing w:before="0" w:after="0" w:line="240" w:lineRule="auto"/>
+      </w:pPr>
+      <w:r>
+        <w:rPr>
+          <w:rFonts w:ascii="Calibri" w:hAnsi="Calibri" w:cs="Calibri"/>
+          <w:b w:val="0"/>
+          <w:color w:val="1C1F24"/>
+          <w:sz w:val="21"/>
+        </w:rPr>
+        <w:t>Moving and Storage</w:t>
+      </w:r>
+    </w:p>
+    <w:p>
+      <w:pPr>
+        <w:pStyle w:val="ListBullet"/>
+        <w:spacing w:before="0" w:after="0" w:line="240" w:lineRule="auto"/>
+      </w:pPr>
+      <w:r>
+        <w:rPr>
+          <w:rFonts w:ascii="Calibri" w:hAnsi="Calibri" w:cs="Calibri"/>
+          <w:b w:val="0"/>
+          <w:color w:val="1C1F24"/>
+          <w:sz w:val="21"/>
+        </w:rPr>
+        <w:t>Decouple legacy WCF based applications from Microsoft AX 2009 to enable smooth upgrade from Microsoft AX (C#)</w:t>
+      </w:r>
+    </w:p>
+    <w:p>
+      <w:pPr>
+        <w:pStyle w:val="ListBullet"/>
+        <w:spacing w:before="0" w:after="0" w:line="240" w:lineRule="auto"/>
+      </w:pPr>
+      <w:r>
+        <w:rPr>
+          <w:rFonts w:ascii="Calibri" w:hAnsi="Calibri" w:cs="Calibri"/>
+          <w:b w:val="0"/>
+          <w:color w:val="1C1F24"/>
+          <w:sz w:val="21"/>
+        </w:rPr>
         <w:t>Troubleshoot issues related to performance and caching (Redis)</w:t>
       </w:r>
     </w:p>
     <w:p>
       <w:pPr>
         <w:pStyle w:val="ListBullet"/>
-        <w:spacing w:before="0" w:after="20" w:line="240" w:lineRule="auto"/>
+        <w:spacing w:before="0" w:after="0" w:line="240" w:lineRule="auto"/>
       </w:pPr>
+      <w:r>
+        <w:rPr>
+          <w:rFonts w:ascii="Calibri" w:hAnsi="Calibri" w:cs="Calibri"/>
+          <w:b w:val="0"/>
+          <w:color w:val="1C1F24"/>
+          <w:sz w:val="21"/>
+        </w:rPr>
+        <w:t>Refactor common code into Nuget packages published on Sonatype Nexus via Bitbucket pipelines (DevOps, C#)</w:t>
+      </w:r>
+    </w:p>
+    <w:p>
+      <w:pPr>
+        <w:pStyle w:val="ListBullet"/>
+        <w:spacing w:before="0" w:after="0" w:line="240" w:lineRule="auto"/>
+      </w:pPr>
+      <w:r>
+        <w:rPr>
+          <w:rFonts w:ascii="Calibri" w:hAnsi="Calibri" w:cs="Calibri"/>
+          <w:b w:val="0"/>
+          <w:color w:val="1C1F24"/>
+          <w:sz w:val="21"/>
+        </w:rPr>
+        <w:t>Participate in PCI DSS gap remediation</w:t>
+      </w:r>
+    </w:p>
+    <w:p>
+      <w:pPr>
+        <w:tabs>
+          <w:tab w:pos="10368" w:val="right"/>
+        </w:tabs>
+        <w:spacing w:before="60" w:after="0" w:line="240" w:lineRule="auto"/>
+      </w:pPr>
+      <w:r>
+        <w:rPr>
+          <w:rFonts w:ascii="Calibri" w:hAnsi="Calibri" w:cs="Calibri"/>
+          <w:b/>
+          <w:color w:val="1C1F24"/>
+          <w:sz w:val="22"/>
+        </w:rPr>
+        <w:t>Senior Software Developer</w:t>
+      </w:r>
       <w:r>
         <w:rPr>
           <w:rFonts w:ascii="Calibri" w:hAnsi="Calibri" w:cs="Calibri"/>
@@ -981,132 +992,16 @@
           <w:color w:val="1C1F24"/>
           <w:sz w:val="22"/>
         </w:rPr>
-        <w:t>Track down source code for legacy applications for which exact source could not be identified (C#, Visual Basic)</w:t>
+        <w:tab/>
+        <w:t>Sep 2015 – Jul 2019</w:t>
       </w:r>
     </w:p>
     <w:p>
       <w:pPr>
-        <w:pStyle w:val="ListBullet"/>
-        <w:spacing w:before="0" w:after="20" w:line="240" w:lineRule="auto"/>
-      </w:pPr>
-      <w:r>
-        <w:rPr>
-          <w:rFonts w:ascii="Calibri" w:hAnsi="Calibri" w:cs="Calibri"/>
-          <w:b w:val="0"/>
-          <w:color w:val="1C1F24"/>
-          <w:sz w:val="22"/>
-        </w:rPr>
-        <w:t>Refactor common code into Nuget packages published on Sonatype Nexus via Bitbucket pipelines (DevOps, C#)</w:t>
-      </w:r>
-    </w:p>
-    <w:p>
-      <w:pPr>
-        <w:pStyle w:val="ListBullet"/>
-        <w:spacing w:before="0" w:after="20" w:line="240" w:lineRule="auto"/>
-      </w:pPr>
-      <w:r>
-        <w:rPr>
-          <w:rFonts w:ascii="Calibri" w:hAnsi="Calibri" w:cs="Calibri"/>
-          <w:b w:val="0"/>
-          <w:color w:val="1C1F24"/>
-          <w:sz w:val="22"/>
-        </w:rPr>
-        <w:t>Automate integration tests with on-premise TFS 2017 (Powershell)</w:t>
-      </w:r>
-    </w:p>
-    <w:p>
-      <w:pPr>
-        <w:pStyle w:val="ListBullet"/>
-        <w:spacing w:before="0" w:after="20" w:line="240" w:lineRule="auto"/>
-      </w:pPr>
-      <w:r>
-        <w:rPr>
-          <w:rFonts w:ascii="Calibri" w:hAnsi="Calibri" w:cs="Calibri"/>
-          <w:b w:val="0"/>
-          <w:color w:val="1C1F24"/>
-          <w:sz w:val="22"/>
-        </w:rPr>
-        <w:t>Create templates for Azure DevOps pipeline automation</w:t>
-      </w:r>
-    </w:p>
-    <w:p>
-      <w:pPr>
-        <w:pStyle w:val="ListBullet"/>
-        <w:spacing w:before="0" w:after="20" w:line="240" w:lineRule="auto"/>
-      </w:pPr>
-      <w:r>
-        <w:rPr>
-          <w:rFonts w:ascii="Calibri" w:hAnsi="Calibri" w:cs="Calibri"/>
-          <w:b w:val="0"/>
-          <w:color w:val="1C1F24"/>
-          <w:sz w:val="22"/>
-        </w:rPr>
-        <w:t>Participate in PCI DSS gap remediation</w:t>
-      </w:r>
-    </w:p>
-    <w:tbl>
-      <w:tblPr>
-        <w:tblW w:type="auto" w:w="0"/>
-        <w:tblLayout w:type="fixed"/>
-        <w:tblLook w:firstColumn="1" w:firstRow="1" w:lastColumn="0" w:lastRow="0" w:noHBand="0" w:noVBand="1" w:val="04A0"/>
-        <w:tblBorders>
-          <w:top w:val="nil"/>
-          <w:left w:val="nil"/>
-          <w:bottom w:val="nil"/>
-          <w:right w:val="nil"/>
-          <w:insideH w:val="nil"/>
-          <w:insideV w:val="nil"/>
-        </w:tblBorders>
-      </w:tblPr>
-      <w:tblGrid>
-        <w:gridCol w:w="5112"/>
-        <w:gridCol w:w="5112"/>
-      </w:tblGrid>
-      <w:tr>
-        <w:tc>
-          <w:tcPr>
-            <w:tcW w:type="dxa" w:w="7704"/>
-          </w:tcPr>
-          <w:p>
-            <w:pPr>
-              <w:spacing w:before="0" w:after="0" w:line="240" w:lineRule="auto"/>
-            </w:pPr>
-            <w:r>
-              <w:rPr>
-                <w:rFonts w:ascii="Calibri" w:hAnsi="Calibri" w:cs="Calibri"/>
-                <w:b/>
-                <w:color w:val="1C1F24"/>
-                <w:sz w:val="22"/>
-              </w:rPr>
-              <w:t>Senior Software Developer</w:t>
-            </w:r>
-          </w:p>
-        </w:tc>
-        <w:tc>
-          <w:tcPr>
-            <w:tcW w:type="dxa" w:w="2520"/>
-          </w:tcPr>
-          <w:p>
-            <w:pPr>
-              <w:spacing w:before="0" w:after="0" w:line="240" w:lineRule="auto"/>
-              <w:jc w:val="right"/>
-            </w:pPr>
-            <w:r>
-              <w:rPr>
-                <w:rFonts w:ascii="Calibri" w:hAnsi="Calibri" w:cs="Calibri"/>
-                <w:b w:val="0"/>
-                <w:color w:val="1C1F24"/>
-                <w:sz w:val="22"/>
-              </w:rPr>
-              <w:t>Sep 2015 – Jul 2019</w:t>
-            </w:r>
-          </w:p>
-        </w:tc>
-      </w:tr>
-    </w:tbl>
-    <w:p>
-      <w:pPr>
-        <w:spacing w:before="0" w:after="40" w:line="240" w:lineRule="auto"/>
+        <w:tabs>
+          <w:tab w:pos="10368" w:val="right"/>
+        </w:tabs>
+        <w:spacing w:before="0" w:after="0" w:line="240" w:lineRule="auto"/>
       </w:pPr>
       <w:r>
         <w:rPr>
@@ -1121,216 +1016,7 @@
     <w:p>
       <w:pPr>
         <w:pStyle w:val="ListBullet"/>
-        <w:spacing w:before="0" w:after="20" w:line="240" w:lineRule="auto"/>
-      </w:pPr>
-      <w:r>
-        <w:rPr>
-          <w:rFonts w:ascii="Calibri" w:hAnsi="Calibri" w:cs="Calibri"/>
-          <w:b w:val="0"/>
-          <w:color w:val="1C1F24"/>
-          <w:sz w:val="22"/>
-        </w:rPr>
-        <w:t>Debug and diagnose obscure race conditions in various environments (JavaScript, Java, SQL)</w:t>
-      </w:r>
-    </w:p>
-    <w:p>
-      <w:pPr>
-        <w:pStyle w:val="ListBullet"/>
-        <w:spacing w:before="0" w:after="20" w:line="240" w:lineRule="auto"/>
-      </w:pPr>
-      <w:r>
-        <w:rPr>
-          <w:rFonts w:ascii="Calibri" w:hAnsi="Calibri" w:cs="Calibri"/>
-          <w:b w:val="0"/>
-          <w:color w:val="1C1F24"/>
-          <w:sz w:val="22"/>
-        </w:rPr>
-        <w:t>Maintain and upgrade legacy Java based systems while launching new systems using .NET (C#, XUnit, Angular, TypeScript)</w:t>
-      </w:r>
-    </w:p>
-    <w:p>
-      <w:pPr>
-        <w:pStyle w:val="ListBullet"/>
-        <w:spacing w:before="0" w:after="20" w:line="240" w:lineRule="auto"/>
-      </w:pPr>
-      <w:r>
-        <w:rPr>
-          <w:rFonts w:ascii="Calibri" w:hAnsi="Calibri" w:cs="Calibri"/>
-          <w:b w:val="0"/>
-          <w:color w:val="1C1F24"/>
-          <w:sz w:val="22"/>
-        </w:rPr>
-        <w:t>Model automated containerized deployment strategies (VirtualBox, VMware Workstation, Docker)</w:t>
-      </w:r>
-    </w:p>
-    <w:p>
-      <w:pPr>
-        <w:pStyle w:val="ListBullet"/>
-        <w:spacing w:before="0" w:after="20" w:line="240" w:lineRule="auto"/>
-      </w:pPr>
-      <w:r>
-        <w:rPr>
-          <w:rFonts w:ascii="Calibri" w:hAnsi="Calibri" w:cs="Calibri"/>
-          <w:b w:val="0"/>
-          <w:color w:val="1C1F24"/>
-          <w:sz w:val="22"/>
-        </w:rPr>
-        <w:t>Integrate credit card / ACH payment system to allow applicants to pre-pay client specified fees (Java, C#)</w:t>
-      </w:r>
-    </w:p>
-    <w:p>
-      <w:pPr>
-        <w:pStyle w:val="ListBullet"/>
-        <w:spacing w:before="0" w:after="20" w:line="240" w:lineRule="auto"/>
-      </w:pPr>
-      <w:r>
-        <w:rPr>
-          <w:rFonts w:ascii="Calibri" w:hAnsi="Calibri" w:cs="Calibri"/>
-          <w:b w:val="0"/>
-          <w:color w:val="1C1F24"/>
-          <w:sz w:val="22"/>
-        </w:rPr>
-        <w:t>Create rule based system for automated appointment of insurance agents (C#)</w:t>
-      </w:r>
-    </w:p>
-    <w:p>
-      <w:pPr>
-        <w:pStyle w:val="ListBullet"/>
-        <w:spacing w:before="0" w:after="20" w:line="240" w:lineRule="auto"/>
-      </w:pPr>
-      <w:r>
-        <w:rPr>
-          <w:rFonts w:ascii="Calibri" w:hAnsi="Calibri" w:cs="Calibri"/>
-          <w:b w:val="0"/>
-          <w:color w:val="1C1F24"/>
-          <w:sz w:val="22"/>
-        </w:rPr>
-        <w:t>Implement unit testing for SQL functions</w:t>
-      </w:r>
-    </w:p>
-    <w:p>
-      <w:pPr>
-        <w:pStyle w:val="ListBullet"/>
-        <w:spacing w:before="0" w:after="20" w:line="240" w:lineRule="auto"/>
-      </w:pPr>
-      <w:r>
-        <w:rPr>
-          <w:rFonts w:ascii="Calibri" w:hAnsi="Calibri" w:cs="Calibri"/>
-          <w:b w:val="0"/>
-          <w:color w:val="1C1F24"/>
-          <w:sz w:val="22"/>
-        </w:rPr>
-        <w:t>Script application deployment using TDD (Powershell, Pester)</w:t>
-      </w:r>
-    </w:p>
-    <w:p>
-      <w:pPr>
-        <w:pStyle w:val="ListBullet"/>
-        <w:spacing w:before="0" w:after="20" w:line="240" w:lineRule="auto"/>
-      </w:pPr>
-      <w:r>
-        <w:rPr>
-          <w:rFonts w:ascii="Calibri" w:hAnsi="Calibri" w:cs="Calibri"/>
-          <w:b w:val="0"/>
-          <w:color w:val="1C1F24"/>
-          <w:sz w:val="22"/>
-        </w:rPr>
-        <w:t>Improve Java coding practices by implementing custom logging, unit testing, and static code analysis (slf4j, junit4, junit5, ErrorProne, SonarQube)</w:t>
-      </w:r>
-    </w:p>
-    <w:p>
-      <w:pPr>
-        <w:pStyle w:val="ListBullet"/>
-        <w:spacing w:before="0" w:after="20" w:line="240" w:lineRule="auto"/>
-      </w:pPr>
-      <w:r>
-        <w:rPr>
-          <w:rFonts w:ascii="Calibri" w:hAnsi="Calibri" w:cs="Calibri"/>
-          <w:b w:val="0"/>
-          <w:color w:val="1C1F24"/>
-          <w:sz w:val="22"/>
-        </w:rPr>
-        <w:t>Create Gradle build scripts for legacy Java applications with custom tasks for local deployment, build versions, and packaging (Java, Gradle, Groovy)</w:t>
-      </w:r>
-    </w:p>
-    <w:p>
-      <w:pPr>
-        <w:pStyle w:val="ListBullet"/>
-        <w:spacing w:before="0" w:after="20" w:line="240" w:lineRule="auto"/>
-      </w:pPr>
-      <w:r>
-        <w:rPr>
-          <w:rFonts w:ascii="Calibri" w:hAnsi="Calibri" w:cs="Calibri"/>
-          <w:b w:val="0"/>
-          <w:color w:val="1C1F24"/>
-          <w:sz w:val="22"/>
-        </w:rPr>
-        <w:t>Tweak legacy apps written with PowerBuilder in PowerScript</w:t>
-      </w:r>
-    </w:p>
-    <w:tbl>
-      <w:tblPr>
-        <w:tblW w:type="auto" w:w="0"/>
-        <w:tblLayout w:type="fixed"/>
-        <w:tblLook w:firstColumn="1" w:firstRow="1" w:lastColumn="0" w:lastRow="0" w:noHBand="0" w:noVBand="1" w:val="04A0"/>
-        <w:tblBorders>
-          <w:top w:val="nil"/>
-          <w:left w:val="nil"/>
-          <w:bottom w:val="nil"/>
-          <w:right w:val="nil"/>
-          <w:insideH w:val="nil"/>
-          <w:insideV w:val="nil"/>
-        </w:tblBorders>
-      </w:tblPr>
-      <w:tblGrid>
-        <w:gridCol w:w="5112"/>
-        <w:gridCol w:w="5112"/>
-      </w:tblGrid>
-      <w:tr>
-        <w:tc>
-          <w:tcPr>
-            <w:tcW w:type="dxa" w:w="7704"/>
-          </w:tcPr>
-          <w:p>
-            <w:pPr>
-              <w:spacing w:before="0" w:after="0" w:line="240" w:lineRule="auto"/>
-            </w:pPr>
-            <w:r>
-              <w:rPr>
-                <w:rFonts w:ascii="Calibri" w:hAnsi="Calibri" w:cs="Calibri"/>
-                <w:b/>
-                <w:color w:val="1C1F24"/>
-                <w:sz w:val="22"/>
-              </w:rPr>
-              <w:t>Software Architect (Part-Time)</w:t>
-            </w:r>
-          </w:p>
-        </w:tc>
-        <w:tc>
-          <w:tcPr>
-            <w:tcW w:type="dxa" w:w="2520"/>
-          </w:tcPr>
-          <w:p>
-            <w:pPr>
-              <w:spacing w:before="0" w:after="0" w:line="240" w:lineRule="auto"/>
-              <w:jc w:val="right"/>
-            </w:pPr>
-            <w:r>
-              <w:rPr>
-                <w:rFonts w:ascii="Calibri" w:hAnsi="Calibri" w:cs="Calibri"/>
-                <w:b w:val="0"/>
-                <w:color w:val="1C1F24"/>
-                <w:sz w:val="22"/>
-              </w:rPr>
-              <w:t>Jul 2015 – Jan 2019</w:t>
-            </w:r>
-          </w:p>
-        </w:tc>
-      </w:tr>
-    </w:tbl>
-    <w:p>
-      <w:pPr>
-        <w:spacing w:before="0" w:after="40" w:line="240" w:lineRule="auto"/>
+        <w:spacing w:before="0" w:after="0" w:line="240" w:lineRule="auto"/>
       </w:pPr>
       <w:r>
         <w:rPr>
@@ -1339,207 +1025,13 @@
           <w:color w:val="1C1F24"/>
           <w:sz w:val="21"/>
         </w:rPr>
-        <w:t>Qualityze Inc., Tampa, FL · Qualityze Systems for Regulated Industries</w:t>
+        <w:t>Debug and diagnose obscure race conditions in various environments (JavaScript, Java, SQL)</w:t>
       </w:r>
     </w:p>
     <w:p>
       <w:pPr>
         <w:pStyle w:val="ListBullet"/>
-        <w:spacing w:before="0" w:after="20" w:line="240" w:lineRule="auto"/>
-      </w:pPr>
-      <w:r>
-        <w:rPr>
-          <w:rFonts w:ascii="Calibri" w:hAnsi="Calibri" w:cs="Calibri"/>
-          <w:b w:val="0"/>
-          <w:color w:val="1C1F24"/>
-          <w:sz w:val="22"/>
-        </w:rPr>
-        <w:t>Implement file conversion using Salesforce Platform Event and Heroku (Java)</w:t>
-      </w:r>
-    </w:p>
-    <w:p>
-      <w:pPr>
-        <w:pStyle w:val="ListBullet"/>
-        <w:spacing w:before="0" w:after="20" w:line="240" w:lineRule="auto"/>
-      </w:pPr>
-      <w:r>
-        <w:rPr>
-          <w:rFonts w:ascii="Calibri" w:hAnsi="Calibri" w:cs="Calibri"/>
-          <w:b w:val="0"/>
-          <w:color w:val="1C1F24"/>
-          <w:sz w:val="22"/>
-        </w:rPr>
-        <w:t>Research managed package automation to scratch orgs (Salesforce DX, Ant)</w:t>
-      </w:r>
-    </w:p>
-    <w:p>
-      <w:pPr>
-        <w:pStyle w:val="ListBullet"/>
-        <w:spacing w:before="0" w:after="20" w:line="240" w:lineRule="auto"/>
-      </w:pPr>
-      <w:r>
-        <w:rPr>
-          <w:rFonts w:ascii="Calibri" w:hAnsi="Calibri" w:cs="Calibri"/>
-          <w:b w:val="0"/>
-          <w:color w:val="1C1F24"/>
-          <w:sz w:val="22"/>
-        </w:rPr>
-        <w:t>Build Quality System as Salesforce managed package (Apex, VisualForce)</w:t>
-      </w:r>
-    </w:p>
-    <w:p>
-      <w:pPr>
-        <w:pStyle w:val="ListBullet"/>
-        <w:spacing w:before="0" w:after="20" w:line="240" w:lineRule="auto"/>
-      </w:pPr>
-      <w:r>
-        <w:rPr>
-          <w:rFonts w:ascii="Calibri" w:hAnsi="Calibri" w:cs="Calibri"/>
-          <w:b w:val="0"/>
-          <w:color w:val="1C1F24"/>
-          <w:sz w:val="22"/>
-        </w:rPr>
-        <w:t>Architect and implement Salesforce managed package secure feature manager</w:t>
-      </w:r>
-    </w:p>
-    <w:p>
-      <w:pPr>
-        <w:pStyle w:val="ListBullet"/>
-        <w:spacing w:before="0" w:after="20" w:line="240" w:lineRule="auto"/>
-      </w:pPr>
-      <w:r>
-        <w:rPr>
-          <w:rFonts w:ascii="Calibri" w:hAnsi="Calibri" w:cs="Calibri"/>
-          <w:b w:val="0"/>
-          <w:color w:val="1C1F24"/>
-          <w:sz w:val="22"/>
-        </w:rPr>
-        <w:t>Implement PDF manipulation using Java running on Heroku uploading to various salesforce orgs (Java, PdfBox, Apex)</w:t>
-      </w:r>
-    </w:p>
-    <w:p>
-      <w:pPr>
-        <w:pStyle w:val="ListBullet"/>
-        <w:spacing w:before="0" w:after="20" w:line="240" w:lineRule="auto"/>
-      </w:pPr>
-      <w:r>
-        <w:rPr>
-          <w:rFonts w:ascii="Calibri" w:hAnsi="Calibri" w:cs="Calibri"/>
-          <w:b w:val="0"/>
-          <w:color w:val="1C1F24"/>
-          <w:sz w:val="22"/>
-        </w:rPr>
-        <w:t>Notify using unobtrusive messages and Salesforce cometD (WebSocket) messaging</w:t>
-      </w:r>
-    </w:p>
-    <w:p>
-      <w:pPr>
-        <w:pStyle w:val="ListBullet"/>
-        <w:spacing w:before="0" w:after="20" w:line="240" w:lineRule="auto"/>
-      </w:pPr>
-      <w:r>
-        <w:rPr>
-          <w:rFonts w:ascii="Calibri" w:hAnsi="Calibri" w:cs="Calibri"/>
-          <w:b w:val="0"/>
-          <w:color w:val="1C1F24"/>
-          <w:sz w:val="22"/>
-        </w:rPr>
-        <w:t>Create method to perform VisualForce injection to increase flexibility of Salesforce managed package (VisualForce)</w:t>
-      </w:r>
-    </w:p>
-    <w:p>
-      <w:pPr>
-        <w:pStyle w:val="ListBullet"/>
-        <w:spacing w:before="0" w:after="20" w:line="240" w:lineRule="auto"/>
-      </w:pPr>
-      <w:r>
-        <w:rPr>
-          <w:rFonts w:ascii="Calibri" w:hAnsi="Calibri" w:cs="Calibri"/>
-          <w:b w:val="0"/>
-          <w:color w:val="1C1F24"/>
-          <w:sz w:val="22"/>
-        </w:rPr>
-        <w:t>Diagnose slow pages in Salesforce and design method to reduce load time</w:t>
-      </w:r>
-    </w:p>
-    <w:p>
-      <w:pPr>
-        <w:pStyle w:val="ListBullet"/>
-        <w:spacing w:before="0" w:after="20" w:line="240" w:lineRule="auto"/>
-      </w:pPr>
-      <w:r>
-        <w:rPr>
-          <w:rFonts w:ascii="Calibri" w:hAnsi="Calibri" w:cs="Calibri"/>
-          <w:b w:val="0"/>
-          <w:color w:val="1C1F24"/>
-          <w:sz w:val="22"/>
-        </w:rPr>
-        <w:t>Design deployment process around github and lack of automation in Salesforce</w:t>
-      </w:r>
-    </w:p>
-    <w:tbl>
-      <w:tblPr>
-        <w:tblW w:type="auto" w:w="0"/>
-        <w:tblLayout w:type="fixed"/>
-        <w:tblLook w:firstColumn="1" w:firstRow="1" w:lastColumn="0" w:lastRow="0" w:noHBand="0" w:noVBand="1" w:val="04A0"/>
-        <w:tblBorders>
-          <w:top w:val="nil"/>
-          <w:left w:val="nil"/>
-          <w:bottom w:val="nil"/>
-          <w:right w:val="nil"/>
-          <w:insideH w:val="nil"/>
-          <w:insideV w:val="nil"/>
-        </w:tblBorders>
-      </w:tblPr>
-      <w:tblGrid>
-        <w:gridCol w:w="5112"/>
-        <w:gridCol w:w="5112"/>
-      </w:tblGrid>
-      <w:tr>
-        <w:tc>
-          <w:tcPr>
-            <w:tcW w:type="dxa" w:w="7704"/>
-          </w:tcPr>
-          <w:p>
-            <w:pPr>
-              <w:spacing w:before="0" w:after="0" w:line="240" w:lineRule="auto"/>
-            </w:pPr>
-            <w:r>
-              <w:rPr>
-                <w:rFonts w:ascii="Calibri" w:hAnsi="Calibri" w:cs="Calibri"/>
-                <w:b/>
-                <w:color w:val="1C1F24"/>
-                <w:sz w:val="22"/>
-              </w:rPr>
-              <w:t>Software Developer (Contractor)</w:t>
-            </w:r>
-          </w:p>
-        </w:tc>
-        <w:tc>
-          <w:tcPr>
-            <w:tcW w:type="dxa" w:w="2520"/>
-          </w:tcPr>
-          <w:p>
-            <w:pPr>
-              <w:spacing w:before="0" w:after="0" w:line="240" w:lineRule="auto"/>
-              <w:jc w:val="right"/>
-            </w:pPr>
-            <w:r>
-              <w:rPr>
-                <w:rFonts w:ascii="Calibri" w:hAnsi="Calibri" w:cs="Calibri"/>
-                <w:b w:val="0"/>
-                <w:color w:val="1C1F24"/>
-                <w:sz w:val="22"/>
-              </w:rPr>
-              <w:t>Dec 2018 – Jan 2019</w:t>
-            </w:r>
-          </w:p>
-        </w:tc>
-      </w:tr>
-    </w:tbl>
-    <w:p>
-      <w:pPr>
-        <w:spacing w:before="0" w:after="40" w:line="240" w:lineRule="auto"/>
+        <w:spacing w:before="0" w:after="0" w:line="240" w:lineRule="auto"/>
       </w:pPr>
       <w:r>
         <w:rPr>
@@ -1548,87 +1040,13 @@
           <w:color w:val="1C1F24"/>
           <w:sz w:val="21"/>
         </w:rPr>
-        <w:t>iReward.io, Trinity, FL · Blockchain Reward System</w:t>
+        <w:t>Maintain and upgrade legacy Java based systems while launching new systems using .NET (C#, XUnit, Angular, TypeScript)</w:t>
       </w:r>
     </w:p>
     <w:p>
       <w:pPr>
         <w:pStyle w:val="ListBullet"/>
-        <w:spacing w:before="0" w:after="20" w:line="240" w:lineRule="auto"/>
-      </w:pPr>
-      <w:r>
-        <w:rPr>
-          <w:rFonts w:ascii="Calibri" w:hAnsi="Calibri" w:cs="Calibri"/>
-          <w:b w:val="0"/>
-          <w:color w:val="1C1F24"/>
-          <w:sz w:val="22"/>
-        </w:rPr>
-        <w:t>Create blockchain reward system on TRON Network (C#, Typescript, Angular)</w:t>
-      </w:r>
-    </w:p>
-    <w:tbl>
-      <w:tblPr>
-        <w:tblW w:type="auto" w:w="0"/>
-        <w:tblLayout w:type="fixed"/>
-        <w:tblLook w:firstColumn="1" w:firstRow="1" w:lastColumn="0" w:lastRow="0" w:noHBand="0" w:noVBand="1" w:val="04A0"/>
-        <w:tblBorders>
-          <w:top w:val="nil"/>
-          <w:left w:val="nil"/>
-          <w:bottom w:val="nil"/>
-          <w:right w:val="nil"/>
-          <w:insideH w:val="nil"/>
-          <w:insideV w:val="nil"/>
-        </w:tblBorders>
-      </w:tblPr>
-      <w:tblGrid>
-        <w:gridCol w:w="5112"/>
-        <w:gridCol w:w="5112"/>
-      </w:tblGrid>
-      <w:tr>
-        <w:tc>
-          <w:tcPr>
-            <w:tcW w:type="dxa" w:w="7704"/>
-          </w:tcPr>
-          <w:p>
-            <w:pPr>
-              <w:spacing w:before="0" w:after="0" w:line="240" w:lineRule="auto"/>
-            </w:pPr>
-            <w:r>
-              <w:rPr>
-                <w:rFonts w:ascii="Calibri" w:hAnsi="Calibri" w:cs="Calibri"/>
-                <w:b/>
-                <w:color w:val="1C1F24"/>
-                <w:sz w:val="22"/>
-              </w:rPr>
-              <w:t>Software Engineer</w:t>
-            </w:r>
-          </w:p>
-        </w:tc>
-        <w:tc>
-          <w:tcPr>
-            <w:tcW w:type="dxa" w:w="2520"/>
-          </w:tcPr>
-          <w:p>
-            <w:pPr>
-              <w:spacing w:before="0" w:after="0" w:line="240" w:lineRule="auto"/>
-              <w:jc w:val="right"/>
-            </w:pPr>
-            <w:r>
-              <w:rPr>
-                <w:rFonts w:ascii="Calibri" w:hAnsi="Calibri" w:cs="Calibri"/>
-                <w:b w:val="0"/>
-                <w:color w:val="1C1F24"/>
-                <w:sz w:val="22"/>
-              </w:rPr>
-              <w:t>Jan 2013 – Sep 2015</w:t>
-            </w:r>
-          </w:p>
-        </w:tc>
-      </w:tr>
-    </w:tbl>
-    <w:p>
-      <w:pPr>
-        <w:spacing w:before="0" w:after="40" w:line="240" w:lineRule="auto"/>
+        <w:spacing w:before="0" w:after="0" w:line="240" w:lineRule="auto"/>
       </w:pPr>
       <w:r>
         <w:rPr>
@@ -1637,14 +1055,55 @@
           <w:color w:val="1C1F24"/>
           <w:sz w:val="21"/>
         </w:rPr>
-        <w:t>CAE USA Inc, Tampa, FL · Military Training Simulation with Active Security Clearance</w:t>
+        <w:t>Integrate credit card / ACH payment system to allow applicants to pre-pay client specified fees (Java, C#)</w:t>
       </w:r>
     </w:p>
     <w:p>
       <w:pPr>
         <w:pStyle w:val="ListBullet"/>
-        <w:spacing w:before="0" w:after="20" w:line="240" w:lineRule="auto"/>
+        <w:spacing w:before="0" w:after="0" w:line="240" w:lineRule="auto"/>
       </w:pPr>
+      <w:r>
+        <w:rPr>
+          <w:rFonts w:ascii="Calibri" w:hAnsi="Calibri" w:cs="Calibri"/>
+          <w:b w:val="0"/>
+          <w:color w:val="1C1F24"/>
+          <w:sz w:val="21"/>
+        </w:rPr>
+        <w:t>Improve Java coding practices by implementing custom logging, unit testing, and static code analysis (slf4j, junit4, junit5, ErrorProne, SonarQube)</w:t>
+      </w:r>
+    </w:p>
+    <w:p>
+      <w:pPr>
+        <w:pStyle w:val="ListBullet"/>
+        <w:spacing w:before="0" w:after="0" w:line="240" w:lineRule="auto"/>
+      </w:pPr>
+      <w:r>
+        <w:rPr>
+          <w:rFonts w:ascii="Calibri" w:hAnsi="Calibri" w:cs="Calibri"/>
+          <w:b w:val="0"/>
+          <w:color w:val="1C1F24"/>
+          <w:sz w:val="21"/>
+        </w:rPr>
+        <w:t>Create Gradle build scripts for legacy Java applications with custom tasks for local deployment, build versions, and packaging (Java, Gradle, Groovy)</w:t>
+      </w:r>
+    </w:p>
+    <w:p>
+      <w:pPr>
+        <w:tabs>
+          <w:tab w:pos="10368" w:val="right"/>
+        </w:tabs>
+        <w:spacing w:before="60" w:after="0" w:line="240" w:lineRule="auto"/>
+      </w:pPr>
+      <w:r>
+        <w:rPr>
+          <w:rFonts w:ascii="Calibri" w:hAnsi="Calibri" w:cs="Calibri"/>
+          <w:b/>
+          <w:color w:val="1C1F24"/>
+          <w:sz w:val="22"/>
+        </w:rPr>
+        <w:t>Software Architect (Part-Time), Qualityze Inc., Tampa, FL</w:t>
+      </w:r>
       <w:r>
         <w:rPr>
           <w:rFonts w:ascii="Calibri" w:hAnsi="Calibri" w:cs="Calibri"/>
@@ -1652,14 +1111,88 @@
           <w:color w:val="1C1F24"/>
           <w:sz w:val="22"/>
         </w:rPr>
-        <w:t>Enhance Ant Contrib cpptasks to generate Visual Studio .sln file and desired .vcproj version to enable source code analysis (Java)</w:t>
+        <w:tab/>
+        <w:t>Jul 2015 – Jan 2019</w:t>
+      </w:r>
+    </w:p>
+    <w:p>
+      <w:pPr>
+        <w:tabs>
+          <w:tab w:pos="10368" w:val="right"/>
+        </w:tabs>
+        <w:spacing w:before="0" w:after="0" w:line="240" w:lineRule="auto"/>
+      </w:pPr>
+      <w:r>
+        <w:rPr>
+          <w:rFonts w:ascii="Calibri" w:hAnsi="Calibri" w:cs="Calibri"/>
+          <w:b w:val="0"/>
+          <w:color w:val="1C1F24"/>
+          <w:sz w:val="21"/>
+        </w:rPr>
+        <w:t>Qualityze Systems for Regulated Industries</w:t>
       </w:r>
     </w:p>
     <w:p>
       <w:pPr>
         <w:pStyle w:val="ListBullet"/>
-        <w:spacing w:before="0" w:after="20" w:line="240" w:lineRule="auto"/>
+        <w:spacing w:before="0" w:after="0" w:line="240" w:lineRule="auto"/>
       </w:pPr>
+      <w:r>
+        <w:rPr>
+          <w:rFonts w:ascii="Calibri" w:hAnsi="Calibri" w:cs="Calibri"/>
+          <w:b w:val="0"/>
+          <w:color w:val="1C1F24"/>
+          <w:sz w:val="21"/>
+        </w:rPr>
+        <w:t>Build Quality System as Salesforce managed package (Apex, VisualForce)</w:t>
+      </w:r>
+    </w:p>
+    <w:p>
+      <w:pPr>
+        <w:pStyle w:val="ListBullet"/>
+        <w:spacing w:before="0" w:after="0" w:line="240" w:lineRule="auto"/>
+      </w:pPr>
+      <w:r>
+        <w:rPr>
+          <w:rFonts w:ascii="Calibri" w:hAnsi="Calibri" w:cs="Calibri"/>
+          <w:b w:val="0"/>
+          <w:color w:val="1C1F24"/>
+          <w:sz w:val="21"/>
+        </w:rPr>
+        <w:t>Implement PDF manipulation using Java running on Heroku uploading to various salesforce orgs (Java, PdfBox, Apex)</w:t>
+      </w:r>
+    </w:p>
+    <w:p>
+      <w:pPr>
+        <w:pStyle w:val="ListBullet"/>
+        <w:spacing w:before="0" w:after="0" w:line="240" w:lineRule="auto"/>
+      </w:pPr>
+      <w:r>
+        <w:rPr>
+          <w:rFonts w:ascii="Calibri" w:hAnsi="Calibri" w:cs="Calibri"/>
+          <w:b w:val="0"/>
+          <w:color w:val="1C1F24"/>
+          <w:sz w:val="21"/>
+        </w:rPr>
+        <w:t>Diagnose slow pages in Salesforce and design method to reduce load time</w:t>
+      </w:r>
+    </w:p>
+    <w:p>
+      <w:pPr>
+        <w:tabs>
+          <w:tab w:pos="10368" w:val="right"/>
+        </w:tabs>
+        <w:spacing w:before="60" w:after="0" w:line="240" w:lineRule="auto"/>
+      </w:pPr>
+      <w:r>
+        <w:rPr>
+          <w:rFonts w:ascii="Calibri" w:hAnsi="Calibri" w:cs="Calibri"/>
+          <w:b/>
+          <w:color w:val="1C1F24"/>
+          <w:sz w:val="22"/>
+        </w:rPr>
+        <w:t>Software Developer (Contractor), iReward.io, Trinity, FL</w:t>
+      </w:r>
       <w:r>
         <w:rPr>
           <w:rFonts w:ascii="Calibri" w:hAnsi="Calibri" w:cs="Calibri"/>
@@ -1667,14 +1200,58 @@
           <w:color w:val="1C1F24"/>
           <w:sz w:val="22"/>
         </w:rPr>
-        <w:t>Deploy and maintained central build automation within secured IT environment (Opscode Chef)</w:t>
+        <w:tab/>
+        <w:t>Dec 2018 – Jan 2019</w:t>
+      </w:r>
+    </w:p>
+    <w:p>
+      <w:pPr>
+        <w:tabs>
+          <w:tab w:pos="10368" w:val="right"/>
+        </w:tabs>
+        <w:spacing w:before="0" w:after="0" w:line="240" w:lineRule="auto"/>
+      </w:pPr>
+      <w:r>
+        <w:rPr>
+          <w:rFonts w:ascii="Calibri" w:hAnsi="Calibri" w:cs="Calibri"/>
+          <w:b w:val="0"/>
+          <w:color w:val="1C1F24"/>
+          <w:sz w:val="21"/>
+        </w:rPr>
+        <w:t>Blockchain Reward System</w:t>
       </w:r>
     </w:p>
     <w:p>
       <w:pPr>
         <w:pStyle w:val="ListBullet"/>
-        <w:spacing w:before="0" w:after="20" w:line="240" w:lineRule="auto"/>
+        <w:spacing w:before="0" w:after="0" w:line="240" w:lineRule="auto"/>
       </w:pPr>
+      <w:r>
+        <w:rPr>
+          <w:rFonts w:ascii="Calibri" w:hAnsi="Calibri" w:cs="Calibri"/>
+          <w:b w:val="0"/>
+          <w:color w:val="1C1F24"/>
+          <w:sz w:val="21"/>
+        </w:rPr>
+        <w:t>Create blockchain reward system on TRON Network (C#, Typescript, Angular)</w:t>
+      </w:r>
+    </w:p>
+    <w:p>
+      <w:pPr>
+        <w:tabs>
+          <w:tab w:pos="10368" w:val="right"/>
+        </w:tabs>
+        <w:spacing w:before="60" w:after="0" w:line="240" w:lineRule="auto"/>
+      </w:pPr>
+      <w:r>
+        <w:rPr>
+          <w:rFonts w:ascii="Calibri" w:hAnsi="Calibri" w:cs="Calibri"/>
+          <w:b/>
+          <w:color w:val="1C1F24"/>
+          <w:sz w:val="22"/>
+        </w:rPr>
+        <w:t>Software Engineer, CAE USA Inc, Tampa, FL</w:t>
+      </w:r>
       <w:r>
         <w:rPr>
           <w:rFonts w:ascii="Calibri" w:hAnsi="Calibri" w:cs="Calibri"/>
@@ -1682,14 +1259,103 @@
           <w:color w:val="1C1F24"/>
           <w:sz w:val="22"/>
         </w:rPr>
-        <w:t>Implement wrapper over single Magnetic Variation model for multiple languages (Ada, C, C++)</w:t>
+        <w:tab/>
+        <w:t>Jan 2013 – Sep 2015</w:t>
+      </w:r>
+    </w:p>
+    <w:p>
+      <w:pPr>
+        <w:tabs>
+          <w:tab w:pos="10368" w:val="right"/>
+        </w:tabs>
+        <w:spacing w:before="0" w:after="0" w:line="240" w:lineRule="auto"/>
+      </w:pPr>
+      <w:r>
+        <w:rPr>
+          <w:rFonts w:ascii="Calibri" w:hAnsi="Calibri" w:cs="Calibri"/>
+          <w:b w:val="0"/>
+          <w:color w:val="1C1F24"/>
+          <w:sz w:val="21"/>
+        </w:rPr>
+        <w:t>Military Training Simulation with Active Security Clearance</w:t>
       </w:r>
     </w:p>
     <w:p>
       <w:pPr>
         <w:pStyle w:val="ListBullet"/>
-        <w:spacing w:before="0" w:after="20" w:line="240" w:lineRule="auto"/>
+        <w:spacing w:before="0" w:after="0" w:line="240" w:lineRule="auto"/>
       </w:pPr>
+      <w:r>
+        <w:rPr>
+          <w:rFonts w:ascii="Calibri" w:hAnsi="Calibri" w:cs="Calibri"/>
+          <w:b w:val="0"/>
+          <w:color w:val="1C1F24"/>
+          <w:sz w:val="21"/>
+        </w:rPr>
+        <w:t>Deploy and maintained central build automation within secured IT environment (Opscode Chef)</w:t>
+      </w:r>
+    </w:p>
+    <w:p>
+      <w:pPr>
+        <w:pStyle w:val="ListBullet"/>
+        <w:spacing w:before="0" w:after="0" w:line="240" w:lineRule="auto"/>
+      </w:pPr>
+      <w:r>
+        <w:rPr>
+          <w:rFonts w:ascii="Calibri" w:hAnsi="Calibri" w:cs="Calibri"/>
+          <w:b w:val="0"/>
+          <w:color w:val="1C1F24"/>
+          <w:sz w:val="21"/>
+        </w:rPr>
+        <w:t>Write Wireshark dissector for network communication with USMC Tactical Environment (Lua)</w:t>
+      </w:r>
+    </w:p>
+    <w:p>
+      <w:pPr>
+        <w:pStyle w:val="ListBullet"/>
+        <w:spacing w:before="0" w:after="0" w:line="240" w:lineRule="auto"/>
+      </w:pPr>
+      <w:r>
+        <w:rPr>
+          <w:rFonts w:ascii="Calibri" w:hAnsi="Calibri" w:cs="Calibri"/>
+          <w:b w:val="0"/>
+          <w:color w:val="1C1F24"/>
+          <w:sz w:val="21"/>
+        </w:rPr>
+        <w:t>Coordinate and present training for software engineers on Automated Testing, Static Code Analysis, and Software Product Lines (Fitnesse, GoogleTest, Selenium)</w:t>
+      </w:r>
+    </w:p>
+    <w:p>
+      <w:pPr>
+        <w:pStyle w:val="ListBullet"/>
+        <w:spacing w:before="0" w:after="0" w:line="240" w:lineRule="auto"/>
+      </w:pPr>
+      <w:r>
+        <w:rPr>
+          <w:rFonts w:ascii="Calibri" w:hAnsi="Calibri" w:cs="Calibri"/>
+          <w:b w:val="0"/>
+          <w:color w:val="1C1F24"/>
+          <w:sz w:val="21"/>
+        </w:rPr>
+        <w:t>Support multiple projects simultaneously; not the norm for recent hires (C++, C, Ada with Linux)</w:t>
+      </w:r>
+    </w:p>
+    <w:p>
+      <w:pPr>
+        <w:tabs>
+          <w:tab w:pos="10368" w:val="right"/>
+        </w:tabs>
+        <w:spacing w:before="60" w:after="0" w:line="240" w:lineRule="auto"/>
+      </w:pPr>
+      <w:r>
+        <w:rPr>
+          <w:rFonts w:ascii="Calibri" w:hAnsi="Calibri" w:cs="Calibri"/>
+          <w:b/>
+          <w:color w:val="1C1F24"/>
+          <w:sz w:val="22"/>
+        </w:rPr>
+        <w:t>Quality Assurance and Regulatory Affairs Manager / Software Developer</w:t>
+      </w:r>
       <w:r>
         <w:rPr>
           <w:rFonts w:ascii="Calibri" w:hAnsi="Calibri" w:cs="Calibri"/>
@@ -1697,177 +1363,16 @@
           <w:color w:val="1C1F24"/>
           <w:sz w:val="22"/>
         </w:rPr>
-        <w:t>Create Visual Studio solution wizard to streamline adoption of software best practices (JavaScript)</w:t>
+        <w:tab/>
+        <w:t>Dec 2003 – Jan 2013</w:t>
       </w:r>
     </w:p>
     <w:p>
       <w:pPr>
-        <w:pStyle w:val="ListBullet"/>
-        <w:spacing w:before="0" w:after="20" w:line="240" w:lineRule="auto"/>
-      </w:pPr>
-      <w:r>
-        <w:rPr>
-          <w:rFonts w:ascii="Calibri" w:hAnsi="Calibri" w:cs="Calibri"/>
-          <w:b w:val="0"/>
-          <w:color w:val="1C1F24"/>
-          <w:sz w:val="22"/>
-        </w:rPr>
-        <w:t>Support multiple projects simultaneously; not the norm for recent hires (C++, C, Ada with Linux)</w:t>
-      </w:r>
-    </w:p>
-    <w:p>
-      <w:pPr>
-        <w:pStyle w:val="ListBullet"/>
-        <w:spacing w:before="0" w:after="20" w:line="240" w:lineRule="auto"/>
-      </w:pPr>
-      <w:r>
-        <w:rPr>
-          <w:rFonts w:ascii="Calibri" w:hAnsi="Calibri" w:cs="Calibri"/>
-          <w:b w:val="0"/>
-          <w:color w:val="1C1F24"/>
-          <w:sz w:val="22"/>
-        </w:rPr>
-        <w:t>Write Wireshark dissector for network communication with USMC Tactical Environment (Lua)</w:t>
-      </w:r>
-    </w:p>
-    <w:p>
-      <w:pPr>
-        <w:pStyle w:val="ListBullet"/>
-        <w:spacing w:before="0" w:after="20" w:line="240" w:lineRule="auto"/>
-      </w:pPr>
-      <w:r>
-        <w:rPr>
-          <w:rFonts w:ascii="Calibri" w:hAnsi="Calibri" w:cs="Calibri"/>
-          <w:b w:val="0"/>
-          <w:color w:val="1C1F24"/>
-          <w:sz w:val="22"/>
-        </w:rPr>
-        <w:t>Identify and implement a database to combine multiple lists of software assets (SQL, VBA) and convert database access to MS SQL and ASP.NET MVC (C#)</w:t>
-      </w:r>
-    </w:p>
-    <w:p>
-      <w:pPr>
-        <w:pStyle w:val="ListBullet"/>
-        <w:spacing w:before="0" w:after="20" w:line="240" w:lineRule="auto"/>
-      </w:pPr>
-      <w:r>
-        <w:rPr>
-          <w:rFonts w:ascii="Calibri" w:hAnsi="Calibri" w:cs="Calibri"/>
-          <w:b w:val="0"/>
-          <w:color w:val="1C1F24"/>
-          <w:sz w:val="22"/>
-        </w:rPr>
-        <w:t>Participate in numerous Kaizen workshops focusing on subjects ranging from software development best practices to identifying tools for saving money</w:t>
-      </w:r>
-    </w:p>
-    <w:p>
-      <w:pPr>
-        <w:pStyle w:val="ListBullet"/>
-        <w:spacing w:before="0" w:after="20" w:line="240" w:lineRule="auto"/>
-      </w:pPr>
-      <w:r>
-        <w:rPr>
-          <w:rFonts w:ascii="Calibri" w:hAnsi="Calibri" w:cs="Calibri"/>
-          <w:b w:val="0"/>
-          <w:color w:val="1C1F24"/>
-          <w:sz w:val="22"/>
-        </w:rPr>
-        <w:t>Coordinate and present training for software engineers on Automated Testing, Static Code Analysis, and Software Product Lines (Fitnesse, GoogleTest, Selenium)</w:t>
-      </w:r>
-    </w:p>
-    <w:p>
-      <w:pPr>
-        <w:pStyle w:val="ListBullet"/>
-        <w:spacing w:before="0" w:after="20" w:line="240" w:lineRule="auto"/>
-      </w:pPr>
-      <w:r>
-        <w:rPr>
-          <w:rFonts w:ascii="Calibri" w:hAnsi="Calibri" w:cs="Calibri"/>
-          <w:b w:val="0"/>
-          <w:color w:val="1C1F24"/>
-          <w:sz w:val="22"/>
-        </w:rPr>
-        <w:t>Develop tool for converting Ant XML build instructions to Visual Studio format (C++)</w:t>
-      </w:r>
-    </w:p>
-    <w:p>
-      <w:pPr>
-        <w:pStyle w:val="ListBullet"/>
-        <w:spacing w:before="0" w:after="20" w:line="240" w:lineRule="auto"/>
-      </w:pPr>
-      <w:r>
-        <w:rPr>
-          <w:rFonts w:ascii="Calibri" w:hAnsi="Calibri" w:cs="Calibri"/>
-          <w:b w:val="0"/>
-          <w:color w:val="1C1F24"/>
-          <w:sz w:val="22"/>
-        </w:rPr>
-        <w:t>Team lead for deployment and institutionalizing internally developed Software Production Line tool</w:t>
-      </w:r>
-    </w:p>
-    <w:tbl>
-      <w:tblPr>
-        <w:tblW w:type="auto" w:w="0"/>
-        <w:tblLayout w:type="fixed"/>
-        <w:tblLook w:firstColumn="1" w:firstRow="1" w:lastColumn="0" w:lastRow="0" w:noHBand="0" w:noVBand="1" w:val="04A0"/>
-        <w:tblBorders>
-          <w:top w:val="nil"/>
-          <w:left w:val="nil"/>
-          <w:bottom w:val="nil"/>
-          <w:right w:val="nil"/>
-          <w:insideH w:val="nil"/>
-          <w:insideV w:val="nil"/>
-        </w:tblBorders>
-      </w:tblPr>
-      <w:tblGrid>
-        <w:gridCol w:w="5112"/>
-        <w:gridCol w:w="5112"/>
-      </w:tblGrid>
-      <w:tr>
-        <w:tc>
-          <w:tcPr>
-            <w:tcW w:type="dxa" w:w="7704"/>
-          </w:tcPr>
-          <w:p>
-            <w:pPr>
-              <w:spacing w:before="0" w:after="0" w:line="240" w:lineRule="auto"/>
-            </w:pPr>
-            <w:r>
-              <w:rPr>
-                <w:rFonts w:ascii="Calibri" w:hAnsi="Calibri" w:cs="Calibri"/>
-                <w:b/>
-                <w:color w:val="1C1F24"/>
-                <w:sz w:val="22"/>
-              </w:rPr>
-              <w:t>Quality Assurance and Regulatory Affairs Manager / Software Developer</w:t>
-            </w:r>
-          </w:p>
-        </w:tc>
-        <w:tc>
-          <w:tcPr>
-            <w:tcW w:type="dxa" w:w="2520"/>
-          </w:tcPr>
-          <w:p>
-            <w:pPr>
-              <w:spacing w:before="0" w:after="0" w:line="240" w:lineRule="auto"/>
-              <w:jc w:val="right"/>
-            </w:pPr>
-            <w:r>
-              <w:rPr>
-                <w:rFonts w:ascii="Calibri" w:hAnsi="Calibri" w:cs="Calibri"/>
-                <w:b w:val="0"/>
-                <w:color w:val="1C1F24"/>
-                <w:sz w:val="22"/>
-              </w:rPr>
-              <w:t>Dec 2003 – Jan 2013</w:t>
-            </w:r>
-          </w:p>
-        </w:tc>
-      </w:tr>
-    </w:tbl>
-    <w:p>
-      <w:pPr>
-        <w:spacing w:before="0" w:after="40" w:line="240" w:lineRule="auto"/>
+        <w:tabs>
+          <w:tab w:pos="10368" w:val="right"/>
+        </w:tabs>
+        <w:spacing w:before="0" w:after="0" w:line="240" w:lineRule="auto"/>
       </w:pPr>
       <w:r>
         <w:rPr>
@@ -1882,74 +1387,14 @@
     <w:p>
       <w:pPr>
         <w:pStyle w:val="ListBullet"/>
-        <w:spacing w:before="0" w:after="20" w:line="240" w:lineRule="auto"/>
+        <w:spacing w:before="0" w:after="0" w:line="240" w:lineRule="auto"/>
       </w:pPr>
       <w:r>
         <w:rPr>
           <w:rFonts w:ascii="Calibri" w:hAnsi="Calibri" w:cs="Calibri"/>
           <w:b w:val="0"/>
           <w:color w:val="1C1F24"/>
-          <w:sz w:val="22"/>
-        </w:rPr>
-        <w:t>Research solutions for validation, auditing, documentation and manufacturing improvements</w:t>
-      </w:r>
-    </w:p>
-    <w:p>
-      <w:pPr>
-        <w:pStyle w:val="ListBullet"/>
-        <w:spacing w:before="0" w:after="20" w:line="240" w:lineRule="auto"/>
-      </w:pPr>
-      <w:r>
-        <w:rPr>
-          <w:rFonts w:ascii="Calibri" w:hAnsi="Calibri" w:cs="Calibri"/>
-          <w:b w:val="0"/>
-          <w:color w:val="1C1F24"/>
-          <w:sz w:val="22"/>
-        </w:rPr>
-        <w:t>Compare and purchase equipment for sterilization, validation, sterile sealing, and automation</w:t>
-      </w:r>
-    </w:p>
-    <w:p>
-      <w:pPr>
-        <w:pStyle w:val="ListBullet"/>
-        <w:spacing w:before="0" w:after="20" w:line="240" w:lineRule="auto"/>
-      </w:pPr>
-      <w:r>
-        <w:rPr>
-          <w:rFonts w:ascii="Calibri" w:hAnsi="Calibri" w:cs="Calibri"/>
-          <w:b w:val="0"/>
-          <w:color w:val="1C1F24"/>
-          <w:sz w:val="22"/>
-        </w:rPr>
-        <w:t>Maintain and upgrade multiple companywide databases from MS Access to MS SQL Server (VBA)</w:t>
-      </w:r>
-    </w:p>
-    <w:p>
-      <w:pPr>
-        <w:pStyle w:val="ListBullet"/>
-        <w:spacing w:before="0" w:after="20" w:line="240" w:lineRule="auto"/>
-      </w:pPr>
-      <w:r>
-        <w:rPr>
-          <w:rFonts w:ascii="Calibri" w:hAnsi="Calibri" w:cs="Calibri"/>
-          <w:b w:val="0"/>
-          <w:color w:val="1C1F24"/>
-          <w:sz w:val="22"/>
-        </w:rPr>
-        <w:t>Optimize Iodine-125 and Palladium-103 decay and tracking systems in MS Access and Excel (VBA)</w:t>
-      </w:r>
-    </w:p>
-    <w:p>
-      <w:pPr>
-        <w:pStyle w:val="ListBullet"/>
-        <w:spacing w:before="0" w:after="20" w:line="240" w:lineRule="auto"/>
-      </w:pPr>
-      <w:r>
-        <w:rPr>
-          <w:rFonts w:ascii="Calibri" w:hAnsi="Calibri" w:cs="Calibri"/>
-          <w:b w:val="0"/>
-          <w:color w:val="1C1F24"/>
-          <w:sz w:val="22"/>
+          <w:sz w:val="21"/>
         </w:rPr>
         <w:t>Perform both software and equipment validation on critical systems</w:t>
       </w:r>
@@ -1957,14 +1402,14 @@
     <w:p>
       <w:pPr>
         <w:pStyle w:val="ListBullet"/>
-        <w:spacing w:before="0" w:after="20" w:line="240" w:lineRule="auto"/>
+        <w:spacing w:before="0" w:after="0" w:line="240" w:lineRule="auto"/>
       </w:pPr>
       <w:r>
         <w:rPr>
           <w:rFonts w:ascii="Calibri" w:hAnsi="Calibri" w:cs="Calibri"/>
           <w:b w:val="0"/>
           <w:color w:val="1C1F24"/>
-          <w:sz w:val="22"/>
+          <w:sz w:val="21"/>
         </w:rPr>
         <w:t>Develop and execute validation protocol for electronic signatures</w:t>
       </w:r>
@@ -1972,44 +1417,14 @@
     <w:p>
       <w:pPr>
         <w:pStyle w:val="ListBullet"/>
-        <w:spacing w:before="0" w:after="20" w:line="240" w:lineRule="auto"/>
+        <w:spacing w:before="0" w:after="0" w:line="240" w:lineRule="auto"/>
       </w:pPr>
       <w:r>
         <w:rPr>
           <w:rFonts w:ascii="Calibri" w:hAnsi="Calibri" w:cs="Calibri"/>
           <w:b w:val="0"/>
           <w:color w:val="1C1F24"/>
-          <w:sz w:val="22"/>
-        </w:rPr>
-        <w:t>Manage simultaneous deadlines for regulatory and quality goals</w:t>
-      </w:r>
-    </w:p>
-    <w:p>
-      <w:pPr>
-        <w:pStyle w:val="ListBullet"/>
-        <w:spacing w:before="0" w:after="20" w:line="240" w:lineRule="auto"/>
-      </w:pPr>
-      <w:r>
-        <w:rPr>
-          <w:rFonts w:ascii="Calibri" w:hAnsi="Calibri" w:cs="Calibri"/>
-          <w:b w:val="0"/>
-          <w:color w:val="1C1F24"/>
-          <w:sz w:val="22"/>
-        </w:rPr>
-        <w:t>Upgrade Quality Assurance System to allow paperless availability</w:t>
-      </w:r>
-    </w:p>
-    <w:p>
-      <w:pPr>
-        <w:pStyle w:val="ListBullet"/>
-        <w:spacing w:before="0" w:after="20" w:line="240" w:lineRule="auto"/>
-      </w:pPr>
-      <w:r>
-        <w:rPr>
-          <w:rFonts w:ascii="Calibri" w:hAnsi="Calibri" w:cs="Calibri"/>
-          <w:b w:val="0"/>
-          <w:color w:val="1C1F24"/>
-          <w:sz w:val="22"/>
+          <w:sz w:val="21"/>
         </w:rPr>
         <w:t>Submit and receive 510(k) submissions to the FDA</w:t>
       </w:r>
@@ -2017,14 +1432,14 @@
     <w:p>
       <w:pPr>
         <w:pStyle w:val="ListBullet"/>
-        <w:spacing w:before="0" w:after="20" w:line="240" w:lineRule="auto"/>
+        <w:spacing w:before="0" w:after="0" w:line="240" w:lineRule="auto"/>
       </w:pPr>
       <w:r>
         <w:rPr>
           <w:rFonts w:ascii="Calibri" w:hAnsi="Calibri" w:cs="Calibri"/>
           <w:b w:val="0"/>
           <w:color w:val="1C1F24"/>
-          <w:sz w:val="22"/>
+          <w:sz w:val="21"/>
         </w:rPr>
         <w:t>Submit and receive medical license applications to Health Canada and EU notified body</w:t>
       </w:r>
@@ -2032,21 +1447,21 @@
     <w:p>
       <w:pPr>
         <w:pStyle w:val="ListBullet"/>
-        <w:spacing w:before="0" w:after="20" w:line="240" w:lineRule="auto"/>
+        <w:spacing w:before="0" w:after="0" w:line="240" w:lineRule="auto"/>
       </w:pPr>
       <w:r>
         <w:rPr>
           <w:rFonts w:ascii="Calibri" w:hAnsi="Calibri" w:cs="Calibri"/>
           <w:b w:val="0"/>
           <w:color w:val="1C1F24"/>
-          <w:sz w:val="22"/>
+          <w:sz w:val="21"/>
         </w:rPr>
         <w:t>Create and execute sterilization validation protocols for both Ethylene Oxide and Steam sterilizers</w:t>
       </w:r>
     </w:p>
     <w:p>
       <w:pPr>
-        <w:spacing w:before="240" w:after="40" w:line="240" w:lineRule="auto"/>
+        <w:spacing w:before="160" w:after="20" w:line="240" w:lineRule="auto"/>
         <w:pBdr>
           <w:bottom w:val="single" w:sz="8" w:space="1" w:color="1C1F24"/>
         </w:pBdr>
@@ -2089,351 +1504,9 @@
         <w:t>University of South Florida · 2012</w:t>
       </w:r>
     </w:p>
-    <w:p>
-      <w:pPr>
-        <w:spacing w:before="240" w:after="40" w:line="240" w:lineRule="auto"/>
-        <w:pBdr>
-          <w:bottom w:val="single" w:sz="8" w:space="1" w:color="1C1F24"/>
-        </w:pBdr>
-      </w:pPr>
-      <w:r>
-        <w:rPr>
-          <w:rFonts w:ascii="Calibri" w:hAnsi="Calibri" w:cs="Calibri"/>
-          <w:b/>
-          <w:color w:val="1C1F24"/>
-          <w:sz w:val="22"/>
-        </w:rPr>
-        <w:t>TRAINING</w:t>
-      </w:r>
-    </w:p>
-    <w:p>
-      <w:pPr>
-        <w:spacing w:before="0" w:after="0" w:line="240" w:lineRule="auto"/>
-      </w:pPr>
-      <w:hyperlink r:id="rId14">
-        <w:r>
-          <w:rPr>
-            <w:rFonts w:ascii="Calibri" w:hAnsi="Calibri" w:cs="Calibri"/>
-            <w:sz w:val="22"/>
-            <w:szCs w:val="22"/>
-            <w:color w:val="1F4B6E"/>
-            <w:u w:val="single"/>
-          </w:rPr>
-          <w:t xml:space="preserve">DEV541: SANS Secure Coding in Java/JEE: Developing Defensible Applications</w:t>
-        </w:r>
-      </w:hyperlink>
-    </w:p>
-    <w:p>
-      <w:pPr>
-        <w:spacing w:before="0" w:after="60" w:line="240" w:lineRule="auto"/>
-      </w:pPr>
-      <w:r>
-        <w:rPr>
-          <w:rFonts w:ascii="Calibri" w:hAnsi="Calibri" w:cs="Calibri"/>
-          <w:b w:val="0"/>
-          <w:color w:val="1C1F24"/>
-          <w:sz w:val="21"/>
-        </w:rPr>
-        <w:t>April 2019 (certified August 2019)</w:t>
-      </w:r>
-    </w:p>
-    <w:p>
-      <w:pPr>
-        <w:spacing w:before="0" w:after="0" w:line="240" w:lineRule="auto"/>
-      </w:pPr>
-      <w:hyperlink r:id="rId15">
-        <w:r>
-          <w:rPr>
-            <w:rFonts w:ascii="Calibri" w:hAnsi="Calibri" w:cs="Calibri"/>
-            <w:sz w:val="22"/>
-            <w:szCs w:val="22"/>
-            <w:color w:val="1F4B6E"/>
-            <w:u w:val="single"/>
-          </w:rPr>
-          <w:t xml:space="preserve">DEV544: SANS Secure Coding in .NET: Developing Defensible Applications</w:t>
-        </w:r>
-      </w:hyperlink>
-    </w:p>
-    <w:p>
-      <w:pPr>
-        <w:spacing w:before="0" w:after="60" w:line="240" w:lineRule="auto"/>
-      </w:pPr>
-      <w:r>
-        <w:rPr>
-          <w:rFonts w:ascii="Calibri" w:hAnsi="Calibri" w:cs="Calibri"/>
-          <w:b w:val="0"/>
-          <w:color w:val="1C1F24"/>
-          <w:sz w:val="21"/>
-        </w:rPr>
-        <w:t>April 2018 (certified August 2018)</w:t>
-      </w:r>
-    </w:p>
-    <w:p>
-      <w:pPr>
-        <w:spacing w:before="0" w:after="0" w:line="240" w:lineRule="auto"/>
-      </w:pPr>
-      <w:hyperlink r:id="rId16">
-        <w:r>
-          <w:rPr>
-            <w:rFonts w:ascii="Calibri" w:hAnsi="Calibri" w:cs="Calibri"/>
-            <w:sz w:val="22"/>
-            <w:szCs w:val="22"/>
-            <w:color w:val="1F4B6E"/>
-            <w:u w:val="single"/>
-          </w:rPr>
-          <w:t xml:space="preserve">SANS Core NetWars Experience</w:t>
-        </w:r>
-      </w:hyperlink>
-    </w:p>
-    <w:p>
-      <w:pPr>
-        <w:spacing w:before="0" w:after="60" w:line="240" w:lineRule="auto"/>
-      </w:pPr>
-      <w:r>
-        <w:rPr>
-          <w:rFonts w:ascii="Calibri" w:hAnsi="Calibri" w:cs="Calibri"/>
-          <w:b w:val="0"/>
-          <w:color w:val="1C1F24"/>
-          <w:sz w:val="21"/>
-        </w:rPr>
-        <w:t>April 2018</w:t>
-      </w:r>
-    </w:p>
-    <w:p>
-      <w:pPr>
-        <w:spacing w:before="0" w:after="0" w:line="240" w:lineRule="auto"/>
-      </w:pPr>
-      <w:hyperlink r:id="rId17">
-        <w:r>
-          <w:rPr>
-            <w:rFonts w:ascii="Calibri" w:hAnsi="Calibri" w:cs="Calibri"/>
-            <w:sz w:val="22"/>
-            <w:szCs w:val="22"/>
-            <w:color w:val="1F4B6E"/>
-            <w:u w:val="single"/>
-          </w:rPr>
-          <w:t xml:space="preserve">OWASP AppSec USA: Hands On Security in DevOps and Application Security Automation Workshop</w:t>
-        </w:r>
-      </w:hyperlink>
-    </w:p>
-    <w:p>
-      <w:pPr>
-        <w:spacing w:before="0" w:after="60" w:line="240" w:lineRule="auto"/>
-      </w:pPr>
-      <w:r>
-        <w:rPr>
-          <w:rFonts w:ascii="Calibri" w:hAnsi="Calibri" w:cs="Calibri"/>
-          <w:b w:val="0"/>
-          <w:color w:val="1C1F24"/>
-          <w:sz w:val="21"/>
-        </w:rPr>
-        <w:t>September 2017</w:t>
-      </w:r>
-    </w:p>
-    <w:p>
-      <w:pPr>
-        <w:spacing w:before="0" w:after="0" w:line="240" w:lineRule="auto"/>
-      </w:pPr>
-      <w:hyperlink r:id="rId18">
-        <w:r>
-          <w:rPr>
-            <w:rFonts w:ascii="Calibri" w:hAnsi="Calibri" w:cs="Calibri"/>
-            <w:sz w:val="22"/>
-            <w:szCs w:val="22"/>
-            <w:color w:val="1F4B6E"/>
-            <w:u w:val="single"/>
-          </w:rPr>
-          <w:t xml:space="preserve">CS169.1x: Software as a Service (Ruby)</w:t>
-        </w:r>
-      </w:hyperlink>
-    </w:p>
-    <w:p>
-      <w:pPr>
-        <w:spacing w:before="0" w:after="60" w:line="240" w:lineRule="auto"/>
-      </w:pPr>
-      <w:r>
-        <w:rPr>
-          <w:rFonts w:ascii="Calibri" w:hAnsi="Calibri" w:cs="Calibri"/>
-          <w:b w:val="0"/>
-          <w:color w:val="1C1F24"/>
-          <w:sz w:val="21"/>
-        </w:rPr>
-        <w:t>June 2014</w:t>
-      </w:r>
-    </w:p>
-    <w:p>
-      <w:pPr>
-        <w:spacing w:before="0" w:after="0" w:line="240" w:lineRule="auto"/>
-      </w:pPr>
-      <w:r>
-        <w:rPr>
-          <w:rFonts w:ascii="Calibri" w:hAnsi="Calibri" w:cs="Calibri"/>
-          <w:b/>
-          <w:color w:val="1C1F24"/>
-          <w:sz w:val="22"/>
-        </w:rPr>
-        <w:t>Software Verification &amp; Validation Strategies (by Noblitt and Rueland)</w:t>
-      </w:r>
-    </w:p>
-    <w:p>
-      <w:pPr>
-        <w:spacing w:before="0" w:after="60" w:line="240" w:lineRule="auto"/>
-      </w:pPr>
-      <w:r>
-        <w:rPr>
-          <w:rFonts w:ascii="Calibri" w:hAnsi="Calibri" w:cs="Calibri"/>
-          <w:b w:val="0"/>
-          <w:color w:val="1C1F24"/>
-          <w:sz w:val="21"/>
-        </w:rPr>
-        <w:t>2010</w:t>
-      </w:r>
-    </w:p>
-    <w:p>
-      <w:pPr>
-        <w:spacing w:before="0" w:after="0" w:line="240" w:lineRule="auto"/>
-      </w:pPr>
-      <w:r>
-        <w:rPr>
-          <w:rFonts w:ascii="Calibri" w:hAnsi="Calibri" w:cs="Calibri"/>
-          <w:b/>
-          <w:color w:val="1C1F24"/>
-          <w:sz w:val="22"/>
-        </w:rPr>
-        <w:t>ISO 14971:2007 Medical devices -- Application of risk management to medical devices</w:t>
-      </w:r>
-    </w:p>
-    <w:p>
-      <w:pPr>
-        <w:spacing w:before="0" w:after="60" w:line="240" w:lineRule="auto"/>
-      </w:pPr>
-      <w:r>
-        <w:rPr>
-          <w:rFonts w:ascii="Calibri" w:hAnsi="Calibri" w:cs="Calibri"/>
-          <w:b w:val="0"/>
-          <w:color w:val="1C1F24"/>
-          <w:sz w:val="21"/>
-        </w:rPr>
-        <w:t>2008</w:t>
-      </w:r>
-    </w:p>
-    <w:p>
-      <w:pPr>
-        <w:spacing w:before="0" w:after="0" w:line="240" w:lineRule="auto"/>
-      </w:pPr>
-      <w:r>
-        <w:rPr>
-          <w:rFonts w:ascii="Calibri" w:hAnsi="Calibri" w:cs="Calibri"/>
-          <w:b/>
-          <w:color w:val="1C1F24"/>
-          <w:sz w:val="22"/>
-        </w:rPr>
-        <w:t>ISO 13485:2003 Medical devices -- Quality management systems -- Requirements for regulatory purposes</w:t>
-      </w:r>
-    </w:p>
-    <w:p>
-      <w:pPr>
-        <w:spacing w:before="0" w:after="60" w:line="240" w:lineRule="auto"/>
-      </w:pPr>
-      <w:r>
-        <w:rPr>
-          <w:rFonts w:ascii="Calibri" w:hAnsi="Calibri" w:cs="Calibri"/>
-          <w:b w:val="0"/>
-          <w:color w:val="1C1F24"/>
-          <w:sz w:val="21"/>
-        </w:rPr>
-        <w:t>2005</w:t>
-      </w:r>
-    </w:p>
-    <w:p>
-      <w:pPr>
-        <w:spacing w:before="240" w:after="40" w:line="240" w:lineRule="auto"/>
-        <w:pBdr>
-          <w:bottom w:val="single" w:sz="8" w:space="1" w:color="1C1F24"/>
-        </w:pBdr>
-      </w:pPr>
-      <w:r>
-        <w:rPr>
-          <w:rFonts w:ascii="Calibri" w:hAnsi="Calibri" w:cs="Calibri"/>
-          <w:b/>
-          <w:color w:val="1C1F24"/>
-          <w:sz w:val="22"/>
-        </w:rPr>
-        <w:t>ADDITIONAL INFORMATION</w:t>
-      </w:r>
-    </w:p>
-    <w:p>
-      <w:pPr>
-        <w:spacing w:before="0" w:after="60" w:line="240" w:lineRule="auto"/>
-      </w:pPr>
-      <w:r>
-        <w:rPr>
-          <w:rFonts w:ascii="Calibri" w:hAnsi="Calibri" w:cs="Calibri"/>
-          <w:b/>
-          <w:color w:val="1C1F24"/>
-          <w:sz w:val="22"/>
-        </w:rPr>
-        <w:t xml:space="preserve">TDD: </w:t>
-      </w:r>
-      <w:r>
-        <w:rPr>
-          <w:rFonts w:ascii="Calibri" w:hAnsi="Calibri" w:cs="Calibri"/>
-          <w:b w:val="0"/>
-          <w:color w:val="1C1F24"/>
-          <w:sz w:val="22"/>
-        </w:rPr>
-        <w:t>I am a proponent of Test Driven Development. I have written tests in Java, C#, C++ Python, Ruby, JavaScript, and even Powershell and SQL. I developed and performed training in automated testing for over 100 developers.</w:t>
-      </w:r>
-    </w:p>
-    <w:p>
-      <w:pPr>
-        <w:spacing w:before="0" w:after="60" w:line="240" w:lineRule="auto"/>
-      </w:pPr>
-      <w:r>
-        <w:rPr>
-          <w:rFonts w:ascii="Calibri" w:hAnsi="Calibri" w:cs="Calibri"/>
-          <w:b/>
-          <w:color w:val="1C1F24"/>
-          <w:sz w:val="22"/>
-        </w:rPr>
-        <w:t xml:space="preserve">Application Security: </w:t>
-      </w:r>
-      <w:r>
-        <w:rPr>
-          <w:rFonts w:ascii="Calibri" w:hAnsi="Calibri" w:cs="Calibri"/>
-          <w:b w:val="0"/>
-          <w:color w:val="1C1F24"/>
-          <w:sz w:val="22"/>
-        </w:rPr>
-        <w:t>In addition to fixing various common sense vulnerabilities (like unauthenticated access and SQL injection) I have begun applying skills learned at various security related training courses.</w:t>
-      </w:r>
-    </w:p>
-    <w:p>
-      <w:pPr>
-        <w:spacing w:before="0" w:after="60" w:line="240" w:lineRule="auto"/>
-      </w:pPr>
-      <w:r>
-        <w:rPr>
-          <w:rFonts w:ascii="Calibri" w:hAnsi="Calibri" w:cs="Calibri"/>
-          <w:b/>
-          <w:color w:val="1C1F24"/>
-          <w:sz w:val="22"/>
-        </w:rPr>
-        <w:t xml:space="preserve">Spoken Languages: </w:t>
-      </w:r>
-      <w:r>
-        <w:rPr>
-          <w:rFonts w:ascii="Calibri" w:hAnsi="Calibri" w:cs="Calibri"/>
-          <w:b w:val="0"/>
-          <w:color w:val="1C1F24"/>
-          <w:sz w:val="22"/>
-        </w:rPr>
-        <w:t>Native English and Spanish speaker</w:t>
-      </w:r>
-    </w:p>
     <w:sectPr>
       <w:pgSz w:w="12240" w:h="15840"/>
-      <w:pgMar w:top="864" w:right="1008" w:bottom="792" w:left="1008" w:header="432" w:footer="432" w:gutter="0"/>
+      <w:pgMar w:top="720" w:right="936" w:bottom="648" w:left="936" w:header="432" w:footer="432" w:gutter="0"/>
       <w:cols w:space="720"/>
       <w:docGrid w:linePitch="360"/>
     </w:sectPr>

</xml_diff>

<commit_message>
Add AI practice to the summary and Mad Mobile work.
Co-authored-by: Benjamin Roedell <benrobot@users.noreply.github.com>
</commit_message>
<xml_diff>
--- a/benjamin-roedell-resume.docx
+++ b/benjamin-roedell-resume.docx
@@ -166,7 +166,7 @@
           <w:color w:val="1C1F24"/>
           <w:sz w:val="22"/>
         </w:rPr>
-        <w:t>I raise delivery quality through automation and advocate for simple, maintainable architecture.</w:t>
+        <w:t>I raise delivery quality through automation and advocate for simple, maintainable architecture. I promote AI tools and services that improve products and productivity, and I keep the coding and delivery practices that make those tools effective.</w:t>
       </w:r>
     </w:p>
     <w:p>
@@ -370,6 +370,36 @@
           <w:sz w:val="21"/>
         </w:rPr>
         <w:t>Restaurant and Retail Software</w:t>
+      </w:r>
+    </w:p>
+    <w:p>
+      <w:pPr>
+        <w:pStyle w:val="ListBullet"/>
+        <w:spacing w:before="0" w:after="0" w:line="240" w:lineRule="auto"/>
+      </w:pPr>
+      <w:r>
+        <w:rPr>
+          <w:rFonts w:ascii="Calibri" w:hAnsi="Calibri" w:cs="Calibri"/>
+          <w:b w:val="0"/>
+          <w:color w:val="1C1F24"/>
+          <w:sz w:val="21"/>
+        </w:rPr>
+        <w:t>Encourage the coding and SDLC practices that make LLMs more effective, including steering QA from AI-run manual testing to Playwright automation after that approach proved expensive</w:t>
+      </w:r>
+    </w:p>
+    <w:p>
+      <w:pPr>
+        <w:pStyle w:val="ListBullet"/>
+        <w:spacing w:before="0" w:after="0" w:line="240" w:lineRule="auto"/>
+      </w:pPr>
+      <w:r>
+        <w:rPr>
+          <w:rFonts w:ascii="Calibri" w:hAnsi="Calibri" w:cs="Calibri"/>
+          <w:b w:val="0"/>
+          <w:color w:val="1C1F24"/>
+          <w:sz w:val="21"/>
+        </w:rPr>
+        <w:t>Enable cloud-based development environments so AI tools are not limited to a single local machine, letting the team work on multiple tasks without slowing those machines</w:t>
       </w:r>
     </w:p>
     <w:p>

</xml_diff>

<commit_message>
Show the architect headline on the site and keep Word to two pages.
Solution Architect stays on the Mad Mobile role. The page subtitle uses the download headline, and the Word file no longer snaps lines to an 18pt grid.

Co-authored-by: Benjamin Roedell <benrobot@users.noreply.github.com>
</commit_message>
<xml_diff>
--- a/benjamin-roedell-resume.docx
+++ b/benjamin-roedell-resume.docx
@@ -5,6 +5,8 @@
     <w:p>
       <w:pPr>
         <w:spacing w:before="0" w:after="0" w:line="240" w:lineRule="auto"/>
+        <w:snapToGrid w:val="0"/>
+        <w:widowControl w:val="0"/>
       </w:pPr>
       <w:r>
         <w:rPr>
@@ -19,6 +21,8 @@
     <w:p>
       <w:pPr>
         <w:spacing w:before="0" w:after="0" w:line="240" w:lineRule="auto"/>
+        <w:snapToGrid w:val="0"/>
+        <w:widowControl w:val="0"/>
       </w:pPr>
       <w:r>
         <w:rPr>
@@ -33,6 +37,8 @@
     <w:p>
       <w:pPr>
         <w:spacing w:before="0" w:after="20" w:line="240" w:lineRule="auto"/>
+        <w:snapToGrid w:val="0"/>
+        <w:widowControl w:val="0"/>
       </w:pPr>
       <w:r>
         <w:rPr>
@@ -47,6 +53,8 @@
     <w:p>
       <w:pPr>
         <w:spacing w:before="0" w:after="40" w:line="240" w:lineRule="auto"/>
+        <w:snapToGrid w:val="0"/>
+        <w:widowControl w:val="0"/>
       </w:pPr>
       <w:hyperlink r:id="rId9">
         <w:r>
@@ -126,7 +134,9 @@
     </w:p>
     <w:p>
       <w:pPr>
-        <w:spacing w:before="160" w:after="20" w:line="240" w:lineRule="auto"/>
+        <w:spacing w:before="80" w:after="20" w:line="240" w:lineRule="auto"/>
+        <w:snapToGrid w:val="0"/>
+        <w:widowControl w:val="0"/>
         <w:pBdr>
           <w:bottom w:val="single" w:sz="8" w:space="1" w:color="1C1F24"/>
         </w:pBdr>
@@ -143,7 +153,9 @@
     </w:p>
     <w:p>
       <w:pPr>
-        <w:spacing w:before="0" w:after="40" w:line="240" w:lineRule="auto"/>
+        <w:spacing w:before="0" w:after="20" w:line="240" w:lineRule="auto"/>
+        <w:snapToGrid w:val="0"/>
+        <w:widowControl w:val="0"/>
       </w:pPr>
       <w:r>
         <w:rPr>
@@ -157,7 +169,9 @@
     </w:p>
     <w:p>
       <w:pPr>
-        <w:spacing w:before="0" w:after="40" w:line="240" w:lineRule="auto"/>
+        <w:spacing w:before="0" w:after="20" w:line="240" w:lineRule="auto"/>
+        <w:snapToGrid w:val="0"/>
+        <w:widowControl w:val="0"/>
       </w:pPr>
       <w:r>
         <w:rPr>
@@ -171,7 +185,9 @@
     </w:p>
     <w:p>
       <w:pPr>
-        <w:spacing w:before="0" w:after="40" w:line="240" w:lineRule="auto"/>
+        <w:spacing w:before="0" w:after="20" w:line="240" w:lineRule="auto"/>
+        <w:snapToGrid w:val="0"/>
+        <w:widowControl w:val="0"/>
       </w:pPr>
       <w:r>
         <w:rPr>
@@ -185,7 +201,9 @@
     </w:p>
     <w:p>
       <w:pPr>
-        <w:spacing w:before="0" w:after="40" w:line="240" w:lineRule="auto"/>
+        <w:spacing w:before="0" w:after="20" w:line="240" w:lineRule="auto"/>
+        <w:snapToGrid w:val="0"/>
+        <w:widowControl w:val="0"/>
       </w:pPr>
       <w:r>
         <w:rPr>
@@ -199,7 +217,9 @@
     </w:p>
     <w:p>
       <w:pPr>
-        <w:spacing w:before="0" w:after="40" w:line="240" w:lineRule="auto"/>
+        <w:spacing w:before="0" w:after="20" w:line="240" w:lineRule="auto"/>
+        <w:snapToGrid w:val="0"/>
+        <w:widowControl w:val="0"/>
       </w:pPr>
       <w:r>
         <w:rPr>
@@ -213,7 +233,9 @@
     </w:p>
     <w:p>
       <w:pPr>
-        <w:spacing w:before="160" w:after="20" w:line="240" w:lineRule="auto"/>
+        <w:spacing w:before="80" w:after="20" w:line="240" w:lineRule="auto"/>
+        <w:snapToGrid w:val="0"/>
+        <w:widowControl w:val="0"/>
         <w:pBdr>
           <w:bottom w:val="single" w:sz="8" w:space="1" w:color="1C1F24"/>
         </w:pBdr>
@@ -231,6 +253,8 @@
     <w:p>
       <w:pPr>
         <w:spacing w:before="20" w:after="20" w:line="240" w:lineRule="auto"/>
+        <w:snapToGrid w:val="0"/>
+        <w:widowControl w:val="0"/>
       </w:pPr>
       <w:hyperlink r:id="rId13">
         <w:r>
@@ -257,6 +281,8 @@
     <w:p>
       <w:pPr>
         <w:spacing w:before="20" w:after="20" w:line="240" w:lineRule="auto"/>
+        <w:snapToGrid w:val="0"/>
+        <w:widowControl w:val="0"/>
       </w:pPr>
       <w:hyperlink r:id="rId14">
         <w:r>
@@ -282,7 +308,9 @@
     </w:p>
     <w:p>
       <w:pPr>
-        <w:spacing w:before="160" w:after="20" w:line="240" w:lineRule="auto"/>
+        <w:spacing w:before="80" w:after="20" w:line="240" w:lineRule="auto"/>
+        <w:snapToGrid w:val="0"/>
+        <w:widowControl w:val="0"/>
         <w:pBdr>
           <w:bottom w:val="single" w:sz="8" w:space="1" w:color="1C1F24"/>
         </w:pBdr>
@@ -299,7 +327,9 @@
     </w:p>
     <w:p>
       <w:pPr>
-        <w:spacing w:before="0" w:after="40" w:line="240" w:lineRule="auto"/>
+        <w:spacing w:before="0" w:after="20" w:line="240" w:lineRule="auto"/>
+        <w:snapToGrid w:val="0"/>
+        <w:widowControl w:val="0"/>
       </w:pPr>
       <w:r>
         <w:rPr>
@@ -313,7 +343,9 @@
     </w:p>
     <w:p>
       <w:pPr>
-        <w:spacing w:before="160" w:after="20" w:line="240" w:lineRule="auto"/>
+        <w:spacing w:before="80" w:after="20" w:line="240" w:lineRule="auto"/>
+        <w:snapToGrid w:val="0"/>
+        <w:widowControl w:val="0"/>
         <w:pBdr>
           <w:bottom w:val="single" w:sz="8" w:space="1" w:color="1C1F24"/>
         </w:pBdr>
@@ -330,10 +362,12 @@
     </w:p>
     <w:p>
       <w:pPr>
+        <w:spacing w:before="20" w:after="0" w:line="240" w:lineRule="auto"/>
         <w:tabs>
           <w:tab w:pos="10368" w:val="right"/>
         </w:tabs>
-        <w:spacing w:before="60" w:after="0" w:line="240" w:lineRule="auto"/>
+        <w:snapToGrid w:val="0"/>
+        <w:widowControl w:val="0"/>
       </w:pPr>
       <w:r>
         <w:rPr>
@@ -357,10 +391,12 @@
     </w:p>
     <w:p>
       <w:pPr>
+        <w:spacing w:before="0" w:after="0" w:line="240" w:lineRule="auto"/>
         <w:tabs>
           <w:tab w:pos="10368" w:val="right"/>
         </w:tabs>
-        <w:spacing w:before="0" w:after="0" w:line="240" w:lineRule="auto"/>
+        <w:snapToGrid w:val="0"/>
+        <w:widowControl w:val="0"/>
       </w:pPr>
       <w:r>
         <w:rPr>
@@ -375,7 +411,9 @@
     <w:p>
       <w:pPr>
         <w:pStyle w:val="ListBullet"/>
-        <w:spacing w:before="0" w:after="0" w:line="240" w:lineRule="auto"/>
+        <w:spacing w:before="0" w:after="0" w:line="260" w:lineRule="exact"/>
+        <w:snapToGrid w:val="0"/>
+        <w:widowControl w:val="0"/>
       </w:pPr>
       <w:r>
         <w:rPr>
@@ -390,7 +428,9 @@
     <w:p>
       <w:pPr>
         <w:pStyle w:val="ListBullet"/>
-        <w:spacing w:before="0" w:after="0" w:line="240" w:lineRule="auto"/>
+        <w:spacing w:before="0" w:after="0" w:line="260" w:lineRule="exact"/>
+        <w:snapToGrid w:val="0"/>
+        <w:widowControl w:val="0"/>
       </w:pPr>
       <w:r>
         <w:rPr>
@@ -405,7 +445,9 @@
     <w:p>
       <w:pPr>
         <w:pStyle w:val="ListBullet"/>
-        <w:spacing w:before="0" w:after="0" w:line="240" w:lineRule="auto"/>
+        <w:spacing w:before="0" w:after="0" w:line="260" w:lineRule="exact"/>
+        <w:snapToGrid w:val="0"/>
+        <w:widowControl w:val="0"/>
       </w:pPr>
       <w:r>
         <w:rPr>
@@ -420,7 +462,9 @@
     <w:p>
       <w:pPr>
         <w:pStyle w:val="ListBullet"/>
-        <w:spacing w:before="0" w:after="0" w:line="240" w:lineRule="auto"/>
+        <w:spacing w:before="0" w:after="0" w:line="260" w:lineRule="exact"/>
+        <w:snapToGrid w:val="0"/>
+        <w:widowControl w:val="0"/>
       </w:pPr>
       <w:r>
         <w:rPr>
@@ -435,7 +479,9 @@
     <w:p>
       <w:pPr>
         <w:pStyle w:val="ListBullet"/>
-        <w:spacing w:before="0" w:after="0" w:line="240" w:lineRule="auto"/>
+        <w:spacing w:before="0" w:after="0" w:line="260" w:lineRule="exact"/>
+        <w:snapToGrid w:val="0"/>
+        <w:widowControl w:val="0"/>
       </w:pPr>
       <w:r>
         <w:rPr>
@@ -450,7 +496,9 @@
     <w:p>
       <w:pPr>
         <w:pStyle w:val="ListBullet"/>
-        <w:spacing w:before="0" w:after="0" w:line="240" w:lineRule="auto"/>
+        <w:spacing w:before="0" w:after="0" w:line="260" w:lineRule="exact"/>
+        <w:snapToGrid w:val="0"/>
+        <w:widowControl w:val="0"/>
       </w:pPr>
       <w:r>
         <w:rPr>
@@ -465,7 +513,9 @@
     <w:p>
       <w:pPr>
         <w:pStyle w:val="ListBullet"/>
-        <w:spacing w:before="0" w:after="0" w:line="240" w:lineRule="auto"/>
+        <w:spacing w:before="0" w:after="0" w:line="260" w:lineRule="exact"/>
+        <w:snapToGrid w:val="0"/>
+        <w:widowControl w:val="0"/>
       </w:pPr>
       <w:r>
         <w:rPr>
@@ -480,7 +530,9 @@
     <w:p>
       <w:pPr>
         <w:pStyle w:val="ListBullet"/>
-        <w:spacing w:before="0" w:after="0" w:line="240" w:lineRule="auto"/>
+        <w:spacing w:before="0" w:after="0" w:line="260" w:lineRule="exact"/>
+        <w:snapToGrid w:val="0"/>
+        <w:widowControl w:val="0"/>
       </w:pPr>
       <w:r>
         <w:rPr>
@@ -495,7 +547,9 @@
     <w:p>
       <w:pPr>
         <w:pStyle w:val="ListBullet"/>
-        <w:spacing w:before="0" w:after="0" w:line="240" w:lineRule="auto"/>
+        <w:spacing w:before="0" w:after="0" w:line="260" w:lineRule="exact"/>
+        <w:snapToGrid w:val="0"/>
+        <w:widowControl w:val="0"/>
       </w:pPr>
       <w:r>
         <w:rPr>
@@ -510,7 +564,9 @@
     <w:p>
       <w:pPr>
         <w:pStyle w:val="ListBullet"/>
-        <w:spacing w:before="0" w:after="0" w:line="240" w:lineRule="auto"/>
+        <w:spacing w:before="0" w:after="0" w:line="260" w:lineRule="exact"/>
+        <w:snapToGrid w:val="0"/>
+        <w:widowControl w:val="0"/>
       </w:pPr>
       <w:r>
         <w:rPr>
@@ -525,7 +581,9 @@
     <w:p>
       <w:pPr>
         <w:pStyle w:val="ListBullet"/>
-        <w:spacing w:before="0" w:after="0" w:line="240" w:lineRule="auto"/>
+        <w:spacing w:before="0" w:after="0" w:line="260" w:lineRule="exact"/>
+        <w:snapToGrid w:val="0"/>
+        <w:widowControl w:val="0"/>
       </w:pPr>
       <w:r>
         <w:rPr>
@@ -539,10 +597,12 @@
     </w:p>
     <w:p>
       <w:pPr>
+        <w:spacing w:before="20" w:after="0" w:line="240" w:lineRule="auto"/>
         <w:tabs>
           <w:tab w:pos="10368" w:val="right"/>
         </w:tabs>
-        <w:spacing w:before="60" w:after="0" w:line="240" w:lineRule="auto"/>
+        <w:snapToGrid w:val="0"/>
+        <w:widowControl w:val="0"/>
       </w:pPr>
       <w:r>
         <w:rPr>
@@ -566,10 +626,12 @@
     </w:p>
     <w:p>
       <w:pPr>
+        <w:spacing w:before="0" w:after="0" w:line="240" w:lineRule="auto"/>
         <w:tabs>
           <w:tab w:pos="10368" w:val="right"/>
         </w:tabs>
-        <w:spacing w:before="0" w:after="0" w:line="240" w:lineRule="auto"/>
+        <w:snapToGrid w:val="0"/>
+        <w:widowControl w:val="0"/>
       </w:pPr>
       <w:r>
         <w:rPr>
@@ -584,7 +646,9 @@
     <w:p>
       <w:pPr>
         <w:pStyle w:val="ListBullet"/>
-        <w:spacing w:before="0" w:after="0" w:line="240" w:lineRule="auto"/>
+        <w:spacing w:before="0" w:after="0" w:line="260" w:lineRule="exact"/>
+        <w:snapToGrid w:val="0"/>
+        <w:widowControl w:val="0"/>
       </w:pPr>
       <w:r>
         <w:rPr>
@@ -599,7 +663,9 @@
     <w:p>
       <w:pPr>
         <w:pStyle w:val="ListBullet"/>
-        <w:spacing w:before="0" w:after="0" w:line="240" w:lineRule="auto"/>
+        <w:spacing w:before="0" w:after="0" w:line="260" w:lineRule="exact"/>
+        <w:snapToGrid w:val="0"/>
+        <w:widowControl w:val="0"/>
       </w:pPr>
       <w:r>
         <w:rPr>
@@ -614,7 +680,9 @@
     <w:p>
       <w:pPr>
         <w:pStyle w:val="ListBullet"/>
-        <w:spacing w:before="0" w:after="0" w:line="240" w:lineRule="auto"/>
+        <w:spacing w:before="0" w:after="0" w:line="260" w:lineRule="exact"/>
+        <w:snapToGrid w:val="0"/>
+        <w:widowControl w:val="0"/>
       </w:pPr>
       <w:r>
         <w:rPr>
@@ -629,7 +697,9 @@
     <w:p>
       <w:pPr>
         <w:pStyle w:val="ListBullet"/>
-        <w:spacing w:before="0" w:after="0" w:line="240" w:lineRule="auto"/>
+        <w:spacing w:before="0" w:after="0" w:line="260" w:lineRule="exact"/>
+        <w:snapToGrid w:val="0"/>
+        <w:widowControl w:val="0"/>
       </w:pPr>
       <w:r>
         <w:rPr>
@@ -644,7 +714,9 @@
     <w:p>
       <w:pPr>
         <w:pStyle w:val="ListBullet"/>
-        <w:spacing w:before="0" w:after="0" w:line="240" w:lineRule="auto"/>
+        <w:spacing w:before="0" w:after="0" w:line="260" w:lineRule="exact"/>
+        <w:snapToGrid w:val="0"/>
+        <w:widowControl w:val="0"/>
       </w:pPr>
       <w:r>
         <w:rPr>
@@ -659,7 +731,9 @@
     <w:p>
       <w:pPr>
         <w:pStyle w:val="ListBullet"/>
-        <w:spacing w:before="0" w:after="0" w:line="240" w:lineRule="auto"/>
+        <w:spacing w:before="0" w:after="0" w:line="260" w:lineRule="exact"/>
+        <w:snapToGrid w:val="0"/>
+        <w:widowControl w:val="0"/>
       </w:pPr>
       <w:r>
         <w:rPr>
@@ -674,7 +748,9 @@
     <w:p>
       <w:pPr>
         <w:pStyle w:val="ListBullet"/>
-        <w:spacing w:before="0" w:after="0" w:line="240" w:lineRule="auto"/>
+        <w:spacing w:before="0" w:after="0" w:line="260" w:lineRule="exact"/>
+        <w:snapToGrid w:val="0"/>
+        <w:widowControl w:val="0"/>
       </w:pPr>
       <w:r>
         <w:rPr>
@@ -689,7 +765,9 @@
     <w:p>
       <w:pPr>
         <w:pStyle w:val="ListBullet"/>
-        <w:spacing w:before="0" w:after="0" w:line="240" w:lineRule="auto"/>
+        <w:spacing w:before="0" w:after="0" w:line="260" w:lineRule="exact"/>
+        <w:snapToGrid w:val="0"/>
+        <w:widowControl w:val="0"/>
       </w:pPr>
       <w:r>
         <w:rPr>
@@ -704,7 +782,9 @@
     <w:p>
       <w:pPr>
         <w:pStyle w:val="ListBullet"/>
-        <w:spacing w:before="0" w:after="0" w:line="240" w:lineRule="auto"/>
+        <w:spacing w:before="0" w:after="0" w:line="260" w:lineRule="exact"/>
+        <w:snapToGrid w:val="0"/>
+        <w:widowControl w:val="0"/>
       </w:pPr>
       <w:r>
         <w:rPr>
@@ -719,7 +799,9 @@
     <w:p>
       <w:pPr>
         <w:pStyle w:val="ListBullet"/>
-        <w:spacing w:before="0" w:after="0" w:line="240" w:lineRule="auto"/>
+        <w:spacing w:before="0" w:after="0" w:line="260" w:lineRule="exact"/>
+        <w:snapToGrid w:val="0"/>
+        <w:widowControl w:val="0"/>
       </w:pPr>
       <w:r>
         <w:rPr>
@@ -734,7 +816,9 @@
     <w:p>
       <w:pPr>
         <w:pStyle w:val="ListBullet"/>
-        <w:spacing w:before="0" w:after="0" w:line="240" w:lineRule="auto"/>
+        <w:spacing w:before="0" w:after="0" w:line="260" w:lineRule="exact"/>
+        <w:snapToGrid w:val="0"/>
+        <w:widowControl w:val="0"/>
       </w:pPr>
       <w:r>
         <w:rPr>
@@ -748,10 +832,12 @@
     </w:p>
     <w:p>
       <w:pPr>
+        <w:spacing w:before="20" w:after="0" w:line="240" w:lineRule="auto"/>
         <w:tabs>
           <w:tab w:pos="10368" w:val="right"/>
         </w:tabs>
-        <w:spacing w:before="60" w:after="0" w:line="240" w:lineRule="auto"/>
+        <w:snapToGrid w:val="0"/>
+        <w:widowControl w:val="0"/>
       </w:pPr>
       <w:r>
         <w:rPr>
@@ -775,10 +861,12 @@
     </w:p>
     <w:p>
       <w:pPr>
+        <w:spacing w:before="0" w:after="0" w:line="240" w:lineRule="auto"/>
         <w:tabs>
           <w:tab w:pos="10368" w:val="right"/>
         </w:tabs>
-        <w:spacing w:before="0" w:after="0" w:line="240" w:lineRule="auto"/>
+        <w:snapToGrid w:val="0"/>
+        <w:widowControl w:val="0"/>
       </w:pPr>
       <w:r>
         <w:rPr>
@@ -793,7 +881,9 @@
     <w:p>
       <w:pPr>
         <w:pStyle w:val="ListBullet"/>
-        <w:spacing w:before="0" w:after="0" w:line="240" w:lineRule="auto"/>
+        <w:spacing w:before="0" w:after="0" w:line="260" w:lineRule="exact"/>
+        <w:snapToGrid w:val="0"/>
+        <w:widowControl w:val="0"/>
       </w:pPr>
       <w:r>
         <w:rPr>
@@ -808,7 +898,9 @@
     <w:p>
       <w:pPr>
         <w:pStyle w:val="ListBullet"/>
-        <w:spacing w:before="0" w:after="0" w:line="240" w:lineRule="auto"/>
+        <w:spacing w:before="0" w:after="0" w:line="260" w:lineRule="exact"/>
+        <w:snapToGrid w:val="0"/>
+        <w:widowControl w:val="0"/>
       </w:pPr>
       <w:r>
         <w:rPr>
@@ -823,7 +915,9 @@
     <w:p>
       <w:pPr>
         <w:pStyle w:val="ListBullet"/>
-        <w:spacing w:before="0" w:after="0" w:line="240" w:lineRule="auto"/>
+        <w:spacing w:before="0" w:after="0" w:line="260" w:lineRule="exact"/>
+        <w:snapToGrid w:val="0"/>
+        <w:widowControl w:val="0"/>
       </w:pPr>
       <w:r>
         <w:rPr>
@@ -838,7 +932,9 @@
     <w:p>
       <w:pPr>
         <w:pStyle w:val="ListBullet"/>
-        <w:spacing w:before="0" w:after="0" w:line="240" w:lineRule="auto"/>
+        <w:spacing w:before="0" w:after="0" w:line="260" w:lineRule="exact"/>
+        <w:snapToGrid w:val="0"/>
+        <w:widowControl w:val="0"/>
       </w:pPr>
       <w:r>
         <w:rPr>
@@ -853,7 +949,9 @@
     <w:p>
       <w:pPr>
         <w:pStyle w:val="ListBullet"/>
-        <w:spacing w:before="0" w:after="0" w:line="240" w:lineRule="auto"/>
+        <w:spacing w:before="0" w:after="0" w:line="260" w:lineRule="exact"/>
+        <w:snapToGrid w:val="0"/>
+        <w:widowControl w:val="0"/>
       </w:pPr>
       <w:r>
         <w:rPr>
@@ -868,7 +966,9 @@
     <w:p>
       <w:pPr>
         <w:pStyle w:val="ListBullet"/>
-        <w:spacing w:before="0" w:after="0" w:line="240" w:lineRule="auto"/>
+        <w:spacing w:before="0" w:after="0" w:line="260" w:lineRule="exact"/>
+        <w:snapToGrid w:val="0"/>
+        <w:widowControl w:val="0"/>
       </w:pPr>
       <w:r>
         <w:rPr>
@@ -883,7 +983,9 @@
     <w:p>
       <w:pPr>
         <w:pStyle w:val="ListBullet"/>
-        <w:spacing w:before="0" w:after="0" w:line="240" w:lineRule="auto"/>
+        <w:spacing w:before="0" w:after="0" w:line="260" w:lineRule="exact"/>
+        <w:snapToGrid w:val="0"/>
+        <w:widowControl w:val="0"/>
       </w:pPr>
       <w:r>
         <w:rPr>
@@ -897,10 +999,12 @@
     </w:p>
     <w:p>
       <w:pPr>
+        <w:spacing w:before="20" w:after="0" w:line="240" w:lineRule="auto"/>
         <w:tabs>
           <w:tab w:pos="10368" w:val="right"/>
         </w:tabs>
-        <w:spacing w:before="60" w:after="0" w:line="240" w:lineRule="auto"/>
+        <w:snapToGrid w:val="0"/>
+        <w:widowControl w:val="0"/>
       </w:pPr>
       <w:r>
         <w:rPr>
@@ -924,10 +1028,12 @@
     </w:p>
     <w:p>
       <w:pPr>
+        <w:spacing w:before="0" w:after="0" w:line="240" w:lineRule="auto"/>
         <w:tabs>
           <w:tab w:pos="10368" w:val="right"/>
         </w:tabs>
-        <w:spacing w:before="0" w:after="0" w:line="240" w:lineRule="auto"/>
+        <w:snapToGrid w:val="0"/>
+        <w:widowControl w:val="0"/>
       </w:pPr>
       <w:r>
         <w:rPr>
@@ -942,7 +1048,9 @@
     <w:p>
       <w:pPr>
         <w:pStyle w:val="ListBullet"/>
-        <w:spacing w:before="0" w:after="0" w:line="240" w:lineRule="auto"/>
+        <w:spacing w:before="0" w:after="0" w:line="260" w:lineRule="exact"/>
+        <w:snapToGrid w:val="0"/>
+        <w:widowControl w:val="0"/>
       </w:pPr>
       <w:r>
         <w:rPr>
@@ -957,7 +1065,9 @@
     <w:p>
       <w:pPr>
         <w:pStyle w:val="ListBullet"/>
-        <w:spacing w:before="0" w:after="0" w:line="240" w:lineRule="auto"/>
+        <w:spacing w:before="0" w:after="0" w:line="260" w:lineRule="exact"/>
+        <w:snapToGrid w:val="0"/>
+        <w:widowControl w:val="0"/>
       </w:pPr>
       <w:r>
         <w:rPr>
@@ -972,7 +1082,9 @@
     <w:p>
       <w:pPr>
         <w:pStyle w:val="ListBullet"/>
-        <w:spacing w:before="0" w:after="0" w:line="240" w:lineRule="auto"/>
+        <w:spacing w:before="0" w:after="0" w:line="260" w:lineRule="exact"/>
+        <w:snapToGrid w:val="0"/>
+        <w:widowControl w:val="0"/>
       </w:pPr>
       <w:r>
         <w:rPr>
@@ -987,7 +1099,9 @@
     <w:p>
       <w:pPr>
         <w:pStyle w:val="ListBullet"/>
-        <w:spacing w:before="0" w:after="0" w:line="240" w:lineRule="auto"/>
+        <w:spacing w:before="0" w:after="0" w:line="260" w:lineRule="exact"/>
+        <w:snapToGrid w:val="0"/>
+        <w:widowControl w:val="0"/>
       </w:pPr>
       <w:r>
         <w:rPr>
@@ -1001,10 +1115,12 @@
     </w:p>
     <w:p>
       <w:pPr>
+        <w:spacing w:before="20" w:after="0" w:line="240" w:lineRule="auto"/>
         <w:tabs>
           <w:tab w:pos="10368" w:val="right"/>
         </w:tabs>
-        <w:spacing w:before="60" w:after="0" w:line="240" w:lineRule="auto"/>
+        <w:snapToGrid w:val="0"/>
+        <w:widowControl w:val="0"/>
       </w:pPr>
       <w:r>
         <w:rPr>
@@ -1028,10 +1144,12 @@
     </w:p>
     <w:p>
       <w:pPr>
+        <w:spacing w:before="0" w:after="0" w:line="240" w:lineRule="auto"/>
         <w:tabs>
           <w:tab w:pos="10368" w:val="right"/>
         </w:tabs>
-        <w:spacing w:before="0" w:after="0" w:line="240" w:lineRule="auto"/>
+        <w:snapToGrid w:val="0"/>
+        <w:widowControl w:val="0"/>
       </w:pPr>
       <w:r>
         <w:rPr>
@@ -1046,7 +1164,9 @@
     <w:p>
       <w:pPr>
         <w:pStyle w:val="ListBullet"/>
-        <w:spacing w:before="0" w:after="0" w:line="240" w:lineRule="auto"/>
+        <w:spacing w:before="0" w:after="0" w:line="260" w:lineRule="exact"/>
+        <w:snapToGrid w:val="0"/>
+        <w:widowControl w:val="0"/>
       </w:pPr>
       <w:r>
         <w:rPr>
@@ -1061,7 +1181,9 @@
     <w:p>
       <w:pPr>
         <w:pStyle w:val="ListBullet"/>
-        <w:spacing w:before="0" w:after="0" w:line="240" w:lineRule="auto"/>
+        <w:spacing w:before="0" w:after="0" w:line="260" w:lineRule="exact"/>
+        <w:snapToGrid w:val="0"/>
+        <w:widowControl w:val="0"/>
       </w:pPr>
       <w:r>
         <w:rPr>
@@ -1076,7 +1198,9 @@
     <w:p>
       <w:pPr>
         <w:pStyle w:val="ListBullet"/>
-        <w:spacing w:before="0" w:after="0" w:line="240" w:lineRule="auto"/>
+        <w:spacing w:before="0" w:after="0" w:line="260" w:lineRule="exact"/>
+        <w:snapToGrid w:val="0"/>
+        <w:widowControl w:val="0"/>
       </w:pPr>
       <w:r>
         <w:rPr>
@@ -1091,7 +1215,9 @@
     <w:p>
       <w:pPr>
         <w:pStyle w:val="ListBullet"/>
-        <w:spacing w:before="0" w:after="0" w:line="240" w:lineRule="auto"/>
+        <w:spacing w:before="0" w:after="0" w:line="260" w:lineRule="exact"/>
+        <w:snapToGrid w:val="0"/>
+        <w:widowControl w:val="0"/>
       </w:pPr>
       <w:r>
         <w:rPr>
@@ -1106,7 +1232,9 @@
     <w:p>
       <w:pPr>
         <w:pStyle w:val="ListBullet"/>
-        <w:spacing w:before="0" w:after="0" w:line="240" w:lineRule="auto"/>
+        <w:spacing w:before="0" w:after="0" w:line="260" w:lineRule="exact"/>
+        <w:snapToGrid w:val="0"/>
+        <w:widowControl w:val="0"/>
       </w:pPr>
       <w:r>
         <w:rPr>
@@ -1120,10 +1248,12 @@
     </w:p>
     <w:p>
       <w:pPr>
+        <w:spacing w:before="20" w:after="0" w:line="240" w:lineRule="auto"/>
         <w:tabs>
           <w:tab w:pos="10368" w:val="right"/>
         </w:tabs>
-        <w:spacing w:before="60" w:after="0" w:line="240" w:lineRule="auto"/>
+        <w:snapToGrid w:val="0"/>
+        <w:widowControl w:val="0"/>
       </w:pPr>
       <w:r>
         <w:rPr>
@@ -1147,10 +1277,12 @@
     </w:p>
     <w:p>
       <w:pPr>
+        <w:spacing w:before="0" w:after="0" w:line="240" w:lineRule="auto"/>
         <w:tabs>
           <w:tab w:pos="10368" w:val="right"/>
         </w:tabs>
-        <w:spacing w:before="0" w:after="0" w:line="240" w:lineRule="auto"/>
+        <w:snapToGrid w:val="0"/>
+        <w:widowControl w:val="0"/>
       </w:pPr>
       <w:r>
         <w:rPr>
@@ -1165,7 +1297,9 @@
     <w:p>
       <w:pPr>
         <w:pStyle w:val="ListBullet"/>
-        <w:spacing w:before="0" w:after="0" w:line="240" w:lineRule="auto"/>
+        <w:spacing w:before="0" w:after="0" w:line="260" w:lineRule="exact"/>
+        <w:snapToGrid w:val="0"/>
+        <w:widowControl w:val="0"/>
       </w:pPr>
       <w:r>
         <w:rPr>
@@ -1180,7 +1314,9 @@
     <w:p>
       <w:pPr>
         <w:pStyle w:val="ListBullet"/>
-        <w:spacing w:before="0" w:after="0" w:line="240" w:lineRule="auto"/>
+        <w:spacing w:before="0" w:after="0" w:line="260" w:lineRule="exact"/>
+        <w:snapToGrid w:val="0"/>
+        <w:widowControl w:val="0"/>
       </w:pPr>
       <w:r>
         <w:rPr>
@@ -1195,7 +1331,9 @@
     <w:p>
       <w:pPr>
         <w:pStyle w:val="ListBullet"/>
-        <w:spacing w:before="0" w:after="0" w:line="240" w:lineRule="auto"/>
+        <w:spacing w:before="0" w:after="0" w:line="260" w:lineRule="exact"/>
+        <w:snapToGrid w:val="0"/>
+        <w:widowControl w:val="0"/>
       </w:pPr>
       <w:r>
         <w:rPr>
@@ -1209,10 +1347,12 @@
     </w:p>
     <w:p>
       <w:pPr>
+        <w:spacing w:before="20" w:after="0" w:line="240" w:lineRule="auto"/>
         <w:tabs>
           <w:tab w:pos="10368" w:val="right"/>
         </w:tabs>
-        <w:spacing w:before="60" w:after="0" w:line="240" w:lineRule="auto"/>
+        <w:snapToGrid w:val="0"/>
+        <w:widowControl w:val="0"/>
       </w:pPr>
       <w:r>
         <w:rPr>
@@ -1236,10 +1376,12 @@
     </w:p>
     <w:p>
       <w:pPr>
+        <w:spacing w:before="0" w:after="0" w:line="240" w:lineRule="auto"/>
         <w:tabs>
           <w:tab w:pos="10368" w:val="right"/>
         </w:tabs>
-        <w:spacing w:before="0" w:after="0" w:line="240" w:lineRule="auto"/>
+        <w:snapToGrid w:val="0"/>
+        <w:widowControl w:val="0"/>
       </w:pPr>
       <w:r>
         <w:rPr>
@@ -1254,7 +1396,9 @@
     <w:p>
       <w:pPr>
         <w:pStyle w:val="ListBullet"/>
-        <w:spacing w:before="0" w:after="0" w:line="240" w:lineRule="auto"/>
+        <w:spacing w:before="0" w:after="0" w:line="260" w:lineRule="exact"/>
+        <w:snapToGrid w:val="0"/>
+        <w:widowControl w:val="0"/>
       </w:pPr>
       <w:r>
         <w:rPr>
@@ -1268,10 +1412,12 @@
     </w:p>
     <w:p>
       <w:pPr>
+        <w:spacing w:before="20" w:after="0" w:line="240" w:lineRule="auto"/>
         <w:tabs>
           <w:tab w:pos="10368" w:val="right"/>
         </w:tabs>
-        <w:spacing w:before="60" w:after="0" w:line="240" w:lineRule="auto"/>
+        <w:snapToGrid w:val="0"/>
+        <w:widowControl w:val="0"/>
       </w:pPr>
       <w:r>
         <w:rPr>
@@ -1295,10 +1441,12 @@
     </w:p>
     <w:p>
       <w:pPr>
+        <w:spacing w:before="0" w:after="0" w:line="240" w:lineRule="auto"/>
         <w:tabs>
           <w:tab w:pos="10368" w:val="right"/>
         </w:tabs>
-        <w:spacing w:before="0" w:after="0" w:line="240" w:lineRule="auto"/>
+        <w:snapToGrid w:val="0"/>
+        <w:widowControl w:val="0"/>
       </w:pPr>
       <w:r>
         <w:rPr>
@@ -1313,7 +1461,9 @@
     <w:p>
       <w:pPr>
         <w:pStyle w:val="ListBullet"/>
-        <w:spacing w:before="0" w:after="0" w:line="240" w:lineRule="auto"/>
+        <w:spacing w:before="0" w:after="0" w:line="260" w:lineRule="exact"/>
+        <w:snapToGrid w:val="0"/>
+        <w:widowControl w:val="0"/>
       </w:pPr>
       <w:r>
         <w:rPr>
@@ -1328,7 +1478,9 @@
     <w:p>
       <w:pPr>
         <w:pStyle w:val="ListBullet"/>
-        <w:spacing w:before="0" w:after="0" w:line="240" w:lineRule="auto"/>
+        <w:spacing w:before="0" w:after="0" w:line="260" w:lineRule="exact"/>
+        <w:snapToGrid w:val="0"/>
+        <w:widowControl w:val="0"/>
       </w:pPr>
       <w:r>
         <w:rPr>
@@ -1343,7 +1495,9 @@
     <w:p>
       <w:pPr>
         <w:pStyle w:val="ListBullet"/>
-        <w:spacing w:before="0" w:after="0" w:line="240" w:lineRule="auto"/>
+        <w:spacing w:before="0" w:after="0" w:line="260" w:lineRule="exact"/>
+        <w:snapToGrid w:val="0"/>
+        <w:widowControl w:val="0"/>
       </w:pPr>
       <w:r>
         <w:rPr>
@@ -1358,7 +1512,9 @@
     <w:p>
       <w:pPr>
         <w:pStyle w:val="ListBullet"/>
-        <w:spacing w:before="0" w:after="0" w:line="240" w:lineRule="auto"/>
+        <w:spacing w:before="0" w:after="0" w:line="260" w:lineRule="exact"/>
+        <w:snapToGrid w:val="0"/>
+        <w:widowControl w:val="0"/>
       </w:pPr>
       <w:r>
         <w:rPr>
@@ -1372,10 +1528,12 @@
     </w:p>
     <w:p>
       <w:pPr>
+        <w:spacing w:before="20" w:after="0" w:line="240" w:lineRule="auto"/>
         <w:tabs>
           <w:tab w:pos="10368" w:val="right"/>
         </w:tabs>
-        <w:spacing w:before="60" w:after="0" w:line="240" w:lineRule="auto"/>
+        <w:snapToGrid w:val="0"/>
+        <w:widowControl w:val="0"/>
       </w:pPr>
       <w:r>
         <w:rPr>
@@ -1399,10 +1557,12 @@
     </w:p>
     <w:p>
       <w:pPr>
+        <w:spacing w:before="0" w:after="0" w:line="240" w:lineRule="auto"/>
         <w:tabs>
           <w:tab w:pos="10368" w:val="right"/>
         </w:tabs>
-        <w:spacing w:before="0" w:after="0" w:line="240" w:lineRule="auto"/>
+        <w:snapToGrid w:val="0"/>
+        <w:widowControl w:val="0"/>
       </w:pPr>
       <w:r>
         <w:rPr>
@@ -1417,7 +1577,9 @@
     <w:p>
       <w:pPr>
         <w:pStyle w:val="ListBullet"/>
-        <w:spacing w:before="0" w:after="0" w:line="240" w:lineRule="auto"/>
+        <w:spacing w:before="0" w:after="0" w:line="260" w:lineRule="exact"/>
+        <w:snapToGrid w:val="0"/>
+        <w:widowControl w:val="0"/>
       </w:pPr>
       <w:r>
         <w:rPr>
@@ -1432,7 +1594,9 @@
     <w:p>
       <w:pPr>
         <w:pStyle w:val="ListBullet"/>
-        <w:spacing w:before="0" w:after="0" w:line="240" w:lineRule="auto"/>
+        <w:spacing w:before="0" w:after="0" w:line="260" w:lineRule="exact"/>
+        <w:snapToGrid w:val="0"/>
+        <w:widowControl w:val="0"/>
       </w:pPr>
       <w:r>
         <w:rPr>
@@ -1447,7 +1611,9 @@
     <w:p>
       <w:pPr>
         <w:pStyle w:val="ListBullet"/>
-        <w:spacing w:before="0" w:after="0" w:line="240" w:lineRule="auto"/>
+        <w:spacing w:before="0" w:after="0" w:line="260" w:lineRule="exact"/>
+        <w:snapToGrid w:val="0"/>
+        <w:widowControl w:val="0"/>
       </w:pPr>
       <w:r>
         <w:rPr>
@@ -1462,7 +1628,9 @@
     <w:p>
       <w:pPr>
         <w:pStyle w:val="ListBullet"/>
-        <w:spacing w:before="0" w:after="0" w:line="240" w:lineRule="auto"/>
+        <w:spacing w:before="0" w:after="0" w:line="260" w:lineRule="exact"/>
+        <w:snapToGrid w:val="0"/>
+        <w:widowControl w:val="0"/>
       </w:pPr>
       <w:r>
         <w:rPr>
@@ -1477,7 +1645,9 @@
     <w:p>
       <w:pPr>
         <w:pStyle w:val="ListBullet"/>
-        <w:spacing w:before="0" w:after="0" w:line="240" w:lineRule="auto"/>
+        <w:spacing w:before="0" w:after="0" w:line="260" w:lineRule="exact"/>
+        <w:snapToGrid w:val="0"/>
+        <w:widowControl w:val="0"/>
       </w:pPr>
       <w:r>
         <w:rPr>
@@ -1491,7 +1661,9 @@
     </w:p>
     <w:p>
       <w:pPr>
-        <w:spacing w:before="160" w:after="20" w:line="240" w:lineRule="auto"/>
+        <w:spacing w:before="80" w:after="20" w:line="240" w:lineRule="auto"/>
+        <w:snapToGrid w:val="0"/>
+        <w:widowControl w:val="0"/>
         <w:pBdr>
           <w:bottom w:val="single" w:sz="8" w:space="1" w:color="1C1F24"/>
         </w:pBdr>
@@ -1509,6 +1681,8 @@
     <w:p>
       <w:pPr>
         <w:spacing w:before="0" w:after="0" w:line="240" w:lineRule="auto"/>
+        <w:snapToGrid w:val="0"/>
+        <w:widowControl w:val="0"/>
       </w:pPr>
       <w:r>
         <w:rPr>
@@ -1523,6 +1697,8 @@
     <w:p>
       <w:pPr>
         <w:spacing w:before="0" w:after="40" w:line="240" w:lineRule="auto"/>
+        <w:snapToGrid w:val="0"/>
+        <w:widowControl w:val="0"/>
       </w:pPr>
       <w:r>
         <w:rPr>
@@ -1538,7 +1714,6 @@
       <w:pgSz w:w="12240" w:h="15840"/>
       <w:pgMar w:top="720" w:right="936" w:bottom="648" w:left="936" w:header="432" w:footer="432" w:gutter="0"/>
       <w:cols w:space="720"/>
-      <w:docGrid w:linePitch="360"/>
     </w:sectPr>
   </w:body>
 </w:document>
@@ -1704,7 +1879,7 @@
       <w:start w:val="1"/>
       <w:numFmt w:val="bullet"/>
       <w:pStyle w:val="ListBullet"/>
-      <w:lvlText w:val=""/>
+      <w:lvlText w:val="•"/>
       <w:lvlJc w:val="left"/>
       <w:pPr>
         <w:tabs>
@@ -1713,7 +1888,9 @@
         <w:ind w:left="360" w:hanging="360"/>
       </w:pPr>
       <w:rPr>
-        <w:rFonts w:ascii="Symbol" w:hAnsi="Symbol" w:hint="default"/>
+        <w:rFonts w:ascii="Calibri" w:hAnsi="Calibri" w:hint="default" w:cs="Calibri"/>
+        <w:sz w:val="21"/>
+        <w:szCs w:val="21"/>
       </w:rPr>
     </w:lvl>
   </w:abstractNum>
@@ -1760,7 +1937,7 @@
     </w:rPrDefault>
     <w:pPrDefault>
       <w:pPr>
-        <w:spacing w:after="200" w:line="276" w:lineRule="auto"/>
+        <w:spacing w:after="0" w:line="240" w:lineRule="auto" w:before="0"/>
       </w:pPr>
     </w:pPrDefault>
   </w:docDefaults>
@@ -1912,6 +2089,9 @@
       <w:color w:val="1C1F24"/>
       <w:sz w:val="22"/>
     </w:rPr>
+    <w:pPr>
+      <w:spacing w:before="0" w:after="0" w:line="240" w:lineRule="auto"/>
+    </w:pPr>
   </w:style>
   <w:style w:type="paragraph" w:styleId="Header">
     <w:name w:val="header"/>

</xml_diff>

<commit_message>
Generate resume PDF and Word files
</commit_message>
<xml_diff>
--- a/benjamin-roedell-resume.docx
+++ b/benjamin-roedell-resume.docx
@@ -180,7 +180,7 @@
           <w:color w:val="1C1F24"/>
           <w:sz w:val="22"/>
         </w:rPr>
-        <w:t>I raise delivery quality through automation and advocate for simple, maintainable architecture. I promote AI tools and services that improve products and productivity, and I keep the coding and delivery practices that make those tools effective.</w:t>
+        <w:t>I raise delivery quality through automation and advocate for simple, maintainable architecture. I promote AI tools and services, including Cursor and Cursor Agents, that improve products and productivity, and I keep the coding and delivery practices that make those tools effective.</w:t>
       </w:r>
     </w:p>
     <w:p>
@@ -338,7 +338,7 @@
           <w:color w:val="1C1F24"/>
           <w:sz w:val="22"/>
         </w:rPr>
-        <w:t>Java · Gradle · C# · AspNetCore · Redis · JavaScript · TypeScript · Angular · React · Playwright · Powershell · JUnit5 · SQL · Docker · Kubernetes · AWS/Azure · CloudFormation · NestJS · RabbitMQ · MongoDB · Snyk · OAuth</w:t>
+        <w:t>Java · Gradle · C# · AspNetCore · Redis · JavaScript · TypeScript · Angular · React · Playwright · Cursor · Powershell · JUnit5 · SQL · Snowflake · Docker · Kubernetes · AWS/Azure · Datadog · CloudFormation · NestJS · RabbitMQ · MongoDB · Snyk · OAuth</w:t>
       </w:r>
     </w:p>
     <w:p>
@@ -439,7 +439,7 @@
           <w:color w:val="1C1F24"/>
           <w:sz w:val="21"/>
         </w:rPr>
-        <w:t>Enable cloud-based development environments so AI tools are not limited to a single local machine, letting the team work on multiple tasks without slowing those machines</w:t>
+        <w:t>Enable cloud-based development environments so Cursor and Cursor Agents are not limited to a single local machine, letting the team work on multiple tasks without slowing those machines</w:t>
       </w:r>
     </w:p>
     <w:p>
@@ -558,6 +558,23 @@
           <w:color w:val="1C1F24"/>
           <w:sz w:val="21"/>
         </w:rPr>
+        <w:t>Initially integrate Neo and Concierge AI with Datadog Real User Monitoring (RUM)</w:t>
+      </w:r>
+    </w:p>
+    <w:p>
+      <w:pPr>
+        <w:pStyle w:val="ListBullet"/>
+        <w:spacing w:before="0" w:after="0" w:line="260" w:lineRule="exact"/>
+        <w:snapToGrid w:val="0"/>
+        <w:widowControl w:val="0"/>
+      </w:pPr>
+      <w:r>
+        <w:rPr>
+          <w:rFonts w:ascii="Calibri" w:hAnsi="Calibri" w:cs="Calibri"/>
+          <w:b w:val="0"/>
+          <w:color w:val="1C1F24"/>
+          <w:sz w:val="21"/>
+        </w:rPr>
         <w:t>Partner with the Cloud team on production ownership, with a clear split between prod and non-prod and explicit access controls</w:t>
       </w:r>
     </w:p>
@@ -575,7 +592,7 @@
           <w:color w:val="1C1F24"/>
           <w:sz w:val="21"/>
         </w:rPr>
-        <w:t>Support Multi-Location Reporting, Enterprise Solutions, and products including CAKE, MenuPad, and Concierge</w:t>
+        <w:t>Integrate Multi-Location Reporting with Snowflake, and support Enterprise Solutions, CAKE, MenuPad, and Concierge</w:t>
       </w:r>
     </w:p>
     <w:p>

</xml_diff>

<commit_message>
Use Applicant Insight as the employer name.
NoMoreForms is a product name, and the longer employer line pushed the company off the job-title row in the resume PDF.

Co-authored-by: benjamin.roedell <benjamin.roedell@madmobile.com>
</commit_message>
<xml_diff>
--- a/benjamin-roedell-resume.docx
+++ b/benjamin-roedell-resume.docx
@@ -1146,7 +1146,7 @@
           <w:color w:val="1C1F24"/>
           <w:sz w:val="22"/>
         </w:rPr>
-        <w:t>Senior Software Developer</w:t>
+        <w:t>Senior Software Developer, Applicant Insight, New Port Richey, FL</w:t>
       </w:r>
       <w:r>
         <w:rPr>
@@ -1175,7 +1175,7 @@
           <w:color w:val="1C1F24"/>
           <w:sz w:val="21"/>
         </w:rPr>
-        <w:t>Applicant Insight / NoMoreForms, New Port Richey, FL · Background Investigation and Applicant Processing</w:t>
+        <w:t>Background Investigation and Applicant Processing</w:t>
       </w:r>
     </w:p>
     <w:p>

</xml_diff>